<commit_message>
vault backup: 2026-07-25 17:22:33
</commit_message>
<xml_diff>
--- a/00.raw-materials/90.processed/LithoAutoPiRun/LithoAutoPiRun_需求申请单_最终版.docx
+++ b/00.raw-materials/90.processed/LithoAutoPiRun/LithoAutoPiRun_需求申请单_最终版.docx
@@ -39,6 +39,7 @@
           <w:i w:val="0"/>
           <w:color w:val="000000"/>
           <w:sz w:val="21"/>
+          <w:u w:val="single"/>
         </w:rPr>
         <w:t xml:space="preserve">　　　　　　　　　　　</w:t>
       </w:r>
@@ -70,8 +71,16 @@
         </w:tblBorders>
       </w:tblPr>
       <w:tblGrid>
-        <w:gridCol w:w="5190"/>
-        <w:gridCol w:w="5190"/>
+        <w:gridCol w:w="1038"/>
+        <w:gridCol w:w="1038"/>
+        <w:gridCol w:w="1038"/>
+        <w:gridCol w:w="1038"/>
+        <w:gridCol w:w="1038"/>
+        <w:gridCol w:w="1038"/>
+        <w:gridCol w:w="1038"/>
+        <w:gridCol w:w="1038"/>
+        <w:gridCol w:w="1038"/>
+        <w:gridCol w:w="1038"/>
       </w:tblGrid>
       <w:tr>
         <w:trPr>
@@ -80,7 +89,7 @@
         <w:tc>
           <w:tcPr>
             <w:tcW w:type="dxa" w:w="10380"/>
-            <w:gridSpan w:val="2"/>
+            <w:gridSpan w:val="10"/>
             <w:tcMar>
               <w:top w:w="90" w:type="dxa"/>
               <w:start w:w="120" w:type="dxa"/>
@@ -91,7 +100,7 @@
           </w:tcPr>
           <w:p>
             <w:pPr>
-              <w:spacing w:before="0" w:after="0" w:line="288" w:lineRule="auto"/>
+              <w:spacing w:before="0" w:after="0" w:line="240" w:lineRule="auto"/>
               <w:jc w:val="left"/>
             </w:pPr>
             <w:r/>
@@ -124,7 +133,8 @@
         </w:trPr>
         <w:tc>
           <w:tcPr>
-            <w:tcW w:type="dxa" w:w="5190"/>
+            <w:tcW w:type="dxa" w:w="4152"/>
+            <w:gridSpan w:val="4"/>
             <w:tcMar>
               <w:top w:w="90" w:type="dxa"/>
               <w:start w:w="120" w:type="dxa"/>
@@ -135,7 +145,7 @@
           </w:tcPr>
           <w:p>
             <w:pPr>
-              <w:spacing w:before="0" w:after="0" w:line="288" w:lineRule="auto"/>
+              <w:spacing w:before="0" w:after="0" w:line="240" w:lineRule="auto"/>
               <w:jc w:val="left"/>
             </w:pPr>
             <w:r/>
@@ -163,7 +173,8 @@
         </w:tc>
         <w:tc>
           <w:tcPr>
-            <w:tcW w:type="dxa" w:w="5190"/>
+            <w:tcW w:type="dxa" w:w="6228"/>
+            <w:gridSpan w:val="6"/>
             <w:tcMar>
               <w:top w:w="90" w:type="dxa"/>
               <w:start w:w="120" w:type="dxa"/>
@@ -174,7 +185,7 @@
           </w:tcPr>
           <w:p>
             <w:pPr>
-              <w:spacing w:before="0" w:after="0" w:line="288" w:lineRule="auto"/>
+              <w:spacing w:before="0" w:after="0" w:line="240" w:lineRule="auto"/>
               <w:jc w:val="left"/>
             </w:pPr>
             <w:r/>
@@ -207,7 +218,8 @@
         </w:trPr>
         <w:tc>
           <w:tcPr>
-            <w:tcW w:type="dxa" w:w="5190"/>
+            <w:tcW w:type="dxa" w:w="4152"/>
+            <w:gridSpan w:val="4"/>
             <w:tcMar>
               <w:top w:w="90" w:type="dxa"/>
               <w:start w:w="120" w:type="dxa"/>
@@ -218,7 +230,7 @@
           </w:tcPr>
           <w:p>
             <w:pPr>
-              <w:spacing w:before="0" w:after="0" w:line="288" w:lineRule="auto"/>
+              <w:spacing w:before="0" w:after="0" w:line="240" w:lineRule="auto"/>
               <w:jc w:val="left"/>
             </w:pPr>
             <w:r/>
@@ -246,7 +258,8 @@
         </w:tc>
         <w:tc>
           <w:tcPr>
-            <w:tcW w:type="dxa" w:w="5190"/>
+            <w:tcW w:type="dxa" w:w="6228"/>
+            <w:gridSpan w:val="6"/>
             <w:tcMar>
               <w:top w:w="90" w:type="dxa"/>
               <w:start w:w="120" w:type="dxa"/>
@@ -257,7 +270,7 @@
           </w:tcPr>
           <w:p>
             <w:pPr>
-              <w:spacing w:before="0" w:after="0" w:line="288" w:lineRule="auto"/>
+              <w:spacing w:before="0" w:after="0" w:line="240" w:lineRule="auto"/>
               <w:jc w:val="left"/>
             </w:pPr>
             <w:r/>
@@ -290,7 +303,8 @@
         </w:trPr>
         <w:tc>
           <w:tcPr>
-            <w:tcW w:type="dxa" w:w="5190"/>
+            <w:tcW w:type="dxa" w:w="4152"/>
+            <w:gridSpan w:val="4"/>
             <w:tcMar>
               <w:top w:w="90" w:type="dxa"/>
               <w:start w:w="120" w:type="dxa"/>
@@ -301,7 +315,7 @@
           </w:tcPr>
           <w:p>
             <w:pPr>
-              <w:spacing w:before="0" w:after="0" w:line="288" w:lineRule="auto"/>
+              <w:spacing w:before="0" w:after="0" w:line="240" w:lineRule="auto"/>
               <w:jc w:val="left"/>
             </w:pPr>
             <w:r/>
@@ -329,7 +343,8 @@
         </w:tc>
         <w:tc>
           <w:tcPr>
-            <w:tcW w:type="dxa" w:w="5190"/>
+            <w:tcW w:type="dxa" w:w="6228"/>
+            <w:gridSpan w:val="6"/>
             <w:tcMar>
               <w:top w:w="90" w:type="dxa"/>
               <w:start w:w="120" w:type="dxa"/>
@@ -340,7 +355,7 @@
           </w:tcPr>
           <w:p>
             <w:pPr>
-              <w:spacing w:before="0" w:after="0" w:line="288" w:lineRule="auto"/>
+              <w:spacing w:before="0" w:after="0" w:line="240" w:lineRule="auto"/>
               <w:jc w:val="left"/>
             </w:pPr>
             <w:r/>
@@ -374,7 +389,7 @@
         <w:tc>
           <w:tcPr>
             <w:tcW w:type="dxa" w:w="10380"/>
-            <w:gridSpan w:val="2"/>
+            <w:gridSpan w:val="10"/>
             <w:tcMar>
               <w:top w:w="90" w:type="dxa"/>
               <w:start w:w="120" w:type="dxa"/>
@@ -391,7 +406,7 @@
           <w:p>
             <w:pPr>
               <w:keepNext/>
-              <w:spacing w:before="100" w:after="40" w:line="360" w:lineRule="auto"/>
+              <w:spacing w:before="60" w:after="20" w:line="312" w:lineRule="auto"/>
               <w:jc w:val="left"/>
             </w:pPr>
             <w:r>
@@ -408,7 +423,7 @@
           <w:p>
             <w:pPr>
               <w:keepNext w:val="0"/>
-              <w:spacing w:before="0" w:after="40" w:line="360" w:lineRule="auto"/>
+              <w:spacing w:before="0" w:after="40" w:line="312" w:lineRule="auto"/>
               <w:ind w:firstLine="420"/>
               <w:jc w:val="both"/>
             </w:pPr>
@@ -432,7 +447,7 @@
         <w:tc>
           <w:tcPr>
             <w:tcW w:type="dxa" w:w="10380"/>
-            <w:gridSpan w:val="2"/>
+            <w:gridSpan w:val="10"/>
             <w:tcMar>
               <w:top w:w="90" w:type="dxa"/>
               <w:start w:w="120" w:type="dxa"/>
@@ -449,7 +464,7 @@
           <w:p>
             <w:pPr>
               <w:keepNext/>
-              <w:spacing w:before="100" w:after="40" w:line="360" w:lineRule="auto"/>
+              <w:spacing w:before="60" w:after="20" w:line="312" w:lineRule="auto"/>
               <w:jc w:val="left"/>
             </w:pPr>
             <w:r>
@@ -466,7 +481,7 @@
           <w:p>
             <w:pPr>
               <w:keepNext/>
-              <w:spacing w:before="80" w:after="40" w:line="360" w:lineRule="auto"/>
+              <w:spacing w:before="60" w:after="20" w:line="312" w:lineRule="auto"/>
               <w:jc w:val="left"/>
             </w:pPr>
             <w:r>
@@ -483,7 +498,7 @@
           <w:p>
             <w:pPr>
               <w:keepNext w:val="0"/>
-              <w:spacing w:before="0" w:after="40" w:line="360" w:lineRule="auto"/>
+              <w:spacing w:before="0" w:after="40" w:line="312" w:lineRule="auto"/>
               <w:ind w:firstLine="420"/>
               <w:jc w:val="both"/>
             </w:pPr>
@@ -501,7 +516,7 @@
           <w:p>
             <w:pPr>
               <w:keepNext/>
-              <w:spacing w:before="80" w:after="40" w:line="360" w:lineRule="auto"/>
+              <w:spacing w:before="60" w:after="20" w:line="312" w:lineRule="auto"/>
               <w:jc w:val="left"/>
             </w:pPr>
             <w:r>
@@ -518,7 +533,7 @@
           <w:p>
             <w:pPr>
               <w:keepNext w:val="0"/>
-              <w:spacing w:before="0" w:after="40" w:line="360" w:lineRule="auto"/>
+              <w:spacing w:before="0" w:after="40" w:line="312" w:lineRule="auto"/>
               <w:ind w:firstLine="420"/>
               <w:jc w:val="both"/>
             </w:pPr>
@@ -540,7 +555,7 @@
         <w:tc>
           <w:tcPr>
             <w:tcW w:type="dxa" w:w="10380"/>
-            <w:gridSpan w:val="2"/>
+            <w:gridSpan w:val="10"/>
             <w:tcMar>
               <w:top w:w="90" w:type="dxa"/>
               <w:start w:w="120" w:type="dxa"/>
@@ -557,7 +572,7 @@
           <w:p>
             <w:pPr>
               <w:keepNext/>
-              <w:spacing w:before="100" w:after="40" w:line="360" w:lineRule="auto"/>
+              <w:spacing w:before="60" w:after="20" w:line="312" w:lineRule="auto"/>
               <w:jc w:val="left"/>
             </w:pPr>
             <w:r>
@@ -574,7 +589,7 @@
           <w:p>
             <w:pPr>
               <w:keepNext/>
-              <w:spacing w:before="100" w:after="40" w:line="360" w:lineRule="auto"/>
+              <w:spacing w:before="60" w:after="20" w:line="312" w:lineRule="auto"/>
               <w:jc w:val="left"/>
             </w:pPr>
             <w:r>
@@ -585,13 +600,13 @@
                 <w:color w:val="000000"/>
                 <w:sz w:val="21"/>
               </w:rPr>
-              <w:t>■　方案逻辑：</w:t>
+              <w:t>■  方案逻辑：</w:t>
             </w:r>
           </w:p>
           <w:p>
             <w:pPr>
               <w:keepNext/>
-              <w:spacing w:before="100" w:after="40" w:line="360" w:lineRule="auto"/>
+              <w:spacing w:before="60" w:after="20" w:line="312" w:lineRule="auto"/>
               <w:jc w:val="left"/>
             </w:pPr>
             <w:r>
@@ -602,13 +617,13 @@
                 <w:color w:val="000000"/>
                 <w:sz w:val="21"/>
               </w:rPr>
-              <w:t>一、RTD新增逻辑</w:t>
+              <w:t>一、 RTD新增逻辑</w:t>
             </w:r>
           </w:p>
           <w:p>
             <w:pPr>
               <w:keepNext w:val="0"/>
-              <w:spacing w:before="0" w:after="40" w:line="360" w:lineRule="auto"/>
+              <w:spacing w:before="0" w:after="40" w:line="312" w:lineRule="auto"/>
               <w:ind w:firstLine="420"/>
               <w:jc w:val="both"/>
             </w:pPr>
@@ -620,13 +635,13 @@
                 <w:color w:val="000000"/>
                 <w:sz w:val="21"/>
               </w:rPr>
-              <w:t>1. 修改 Report：Central_GetLithoR2RAutoPirunInfo 中的 Pilot 选择逻辑；2. 增加 Report：LithoPiLotAutoDoAdhocSorter；3. Rule 和 Assign 中增加子母批作业同一机台逻辑。</w:t>
+              <w:t>1. 修改 Report： Central_GetLithoR2RAutoPirunInfo 中的 Pilot 选择逻辑；2.增加 Report：LithoPiLotAutoDoAdhocSorter；3.Rule和 Assign 中增加子母批作业同一机台逻辑</w:t>
             </w:r>
           </w:p>
           <w:p>
             <w:pPr>
               <w:keepNext/>
-              <w:spacing w:before="100" w:after="40" w:line="360" w:lineRule="auto"/>
+              <w:spacing w:before="60" w:after="20" w:line="312" w:lineRule="auto"/>
               <w:jc w:val="left"/>
             </w:pPr>
             <w:r>
@@ -643,7 +658,7 @@
           <w:p>
             <w:pPr>
               <w:keepNext w:val="0"/>
-              <w:spacing w:before="0" w:after="40" w:line="360" w:lineRule="auto"/>
+              <w:spacing w:before="0" w:after="40" w:line="312" w:lineRule="auto"/>
               <w:ind w:firstLine="420"/>
               <w:jc w:val="both"/>
             </w:pPr>
@@ -655,13 +670,13 @@
                 <w:color w:val="000000"/>
                 <w:sz w:val="21"/>
               </w:rPr>
-              <w:t>对选 Lot 和选片逻辑进行修改。</w:t>
+              <w:t>对选 lot 和选片逻辑进行修改。</w:t>
             </w:r>
           </w:p>
           <w:p>
             <w:pPr>
               <w:keepNext/>
-              <w:spacing w:before="80" w:after="40" w:line="360" w:lineRule="auto"/>
+              <w:spacing w:before="60" w:after="20" w:line="312" w:lineRule="auto"/>
               <w:jc w:val="left"/>
             </w:pPr>
             <w:r>
@@ -678,7 +693,7 @@
           <w:p>
             <w:pPr>
               <w:keepNext w:val="0"/>
-              <w:spacing w:before="0" w:after="40" w:line="360" w:lineRule="auto"/>
+              <w:spacing w:before="0" w:after="40" w:line="312" w:lineRule="auto"/>
               <w:ind w:firstLine="420"/>
               <w:jc w:val="both"/>
             </w:pPr>
@@ -696,7 +711,7 @@
           <w:p>
             <w:pPr>
               <w:keepNext/>
-              <w:spacing w:before="60" w:after="40" w:line="360" w:lineRule="auto"/>
+              <w:spacing w:before="40" w:after="20" w:line="312" w:lineRule="auto"/>
               <w:jc w:val="left"/>
             </w:pPr>
             <w:r>
@@ -713,7 +728,7 @@
           <w:p>
             <w:pPr>
               <w:keepNext w:val="0"/>
-              <w:spacing w:before="0" w:after="40" w:line="360" w:lineRule="auto"/>
+              <w:spacing w:before="0" w:after="40" w:line="312" w:lineRule="auto"/>
               <w:ind w:firstLine="420"/>
               <w:jc w:val="both"/>
             </w:pPr>
@@ -725,13 +740,13 @@
                 <w:color w:val="000000"/>
                 <w:sz w:val="21"/>
               </w:rPr>
-              <w:t>通过表 fwlot 获取 appid、priority、processingstatus、componentqty 栏位信息；</w:t>
+              <w:t>通过表fwlot获取appid、priority、processingstatus、componentqty栏位信息；</w:t>
             </w:r>
           </w:p>
           <w:p>
             <w:pPr>
               <w:keepNext w:val="0"/>
-              <w:spacing w:before="0" w:after="40" w:line="360" w:lineRule="auto"/>
+              <w:spacing w:before="0" w:after="40" w:line="312" w:lineRule="auto"/>
               <w:ind w:firstLine="420"/>
               <w:jc w:val="both"/>
             </w:pPr>
@@ -743,13 +758,13 @@
                 <w:color w:val="000000"/>
                 <w:sz w:val="21"/>
               </w:rPr>
-              <w:t>通过表 fablotext 获取 requiredcapability、runcardid、reticleid 栏位信息；</w:t>
+              <w:t>通过表fablotext获取requiredcapability、runcardid、reticleid栏位信息；</w:t>
             </w:r>
           </w:p>
           <w:p>
             <w:pPr>
               <w:keepNext w:val="0"/>
-              <w:spacing w:before="0" w:after="40" w:line="360" w:lineRule="auto"/>
+              <w:spacing w:before="0" w:after="40" w:line="312" w:lineRule="auto"/>
               <w:ind w:firstLine="420"/>
               <w:jc w:val="both"/>
             </w:pPr>
@@ -761,13 +776,13 @@
                 <w:color w:val="000000"/>
                 <w:sz w:val="21"/>
               </w:rPr>
-              <w:t>通过表 fablotcarrierext 获取 carrierkind 栏位信息；</w:t>
+              <w:t>通过表fablotcarrierext获取carrierkind栏位信息；</w:t>
             </w:r>
           </w:p>
           <w:p>
             <w:pPr>
               <w:keepNext w:val="0"/>
-              <w:spacing w:before="0" w:after="40" w:line="360" w:lineRule="auto"/>
+              <w:spacing w:before="0" w:after="40" w:line="312" w:lineRule="auto"/>
               <w:ind w:firstLine="420"/>
               <w:jc w:val="both"/>
             </w:pPr>
@@ -779,13 +794,13 @@
                 <w:color w:val="000000"/>
                 <w:sz w:val="21"/>
               </w:rPr>
-              <w:t>通过 fabinqtimeprocess 获取 RemainQ 栏位信息；</w:t>
+              <w:t>通过fabinqtimeprocess获取RemainQ栏位信息；</w:t>
             </w:r>
           </w:p>
           <w:p>
             <w:pPr>
               <w:keepNext w:val="0"/>
-              <w:spacing w:before="0" w:after="40" w:line="360" w:lineRule="auto"/>
+              <w:spacing w:before="0" w:after="40" w:line="312" w:lineRule="auto"/>
               <w:ind w:firstLine="420"/>
               <w:jc w:val="both"/>
             </w:pPr>
@@ -797,13 +812,13 @@
                 <w:color w:val="000000"/>
                 <w:sz w:val="21"/>
               </w:rPr>
-              <w:t>从 UI.RTDConfig-LITHOLotAssignment-LithoAssignCapability 中获取 LithoCapability。BARCO Capability 为 L-BARCO-L、L-BARCO-S。</w:t>
+              <w:t>从 UI.RTDConfig-LITHOLotAssignment-LithoAssignCapability 中获取 LithoCapability；BARCO Capability 固定为 L-BARCO-L、L-BARCO-S。</w:t>
             </w:r>
           </w:p>
           <w:p>
             <w:pPr>
               <w:keepNext/>
-              <w:spacing w:before="60" w:after="40" w:line="360" w:lineRule="auto"/>
+              <w:spacing w:before="40" w:after="20" w:line="312" w:lineRule="auto"/>
               <w:jc w:val="left"/>
             </w:pPr>
             <w:r>
@@ -820,7 +835,7 @@
           <w:p>
             <w:pPr>
               <w:keepNext w:val="0"/>
-              <w:spacing w:before="0" w:after="40" w:line="360" w:lineRule="auto"/>
+              <w:spacing w:before="0" w:after="40" w:line="312" w:lineRule="auto"/>
               <w:ind w:firstLine="420"/>
               <w:jc w:val="both"/>
             </w:pPr>
@@ -838,7 +853,7 @@
           <w:p>
             <w:pPr>
               <w:keepNext w:val="0"/>
-              <w:spacing w:before="0" w:after="20" w:line="360" w:lineRule="auto"/>
+              <w:spacing w:before="0" w:after="20" w:line="312" w:lineRule="auto"/>
               <w:ind w:left="420"/>
               <w:jc w:val="both"/>
             </w:pPr>
@@ -850,13 +865,13 @@
                 <w:color w:val="000000"/>
                 <w:sz w:val="21"/>
               </w:rPr>
-              <w:t>（1）基本条件过滤：筛选同时满足 processingstatus='Active' 或 'CrossFabTransferred'、carrierkind='FOUP'、runcardid 为空、requiredcapability 为 LithoCapability、L-BARCO-L 或 L-BARCO-S 的 Lot。</w:t>
+              <w:t>（1）基本条件过滤：筛选出满足 processingstatus = 'Active' or 'CrossFabTransferred'，carrierkind = 'FOUP'、runcardid 为空、requiredcapability In（LithoCapability，L-BARCO-L，L-BARCO-S）的 Lot。</w:t>
             </w:r>
           </w:p>
           <w:p>
             <w:pPr>
               <w:keepNext w:val="0"/>
-              <w:spacing w:before="0" w:after="20" w:line="360" w:lineRule="auto"/>
+              <w:spacing w:before="0" w:after="20" w:line="312" w:lineRule="auto"/>
               <w:ind w:left="420"/>
               <w:jc w:val="both"/>
             </w:pPr>
@@ -868,13 +883,13 @@
                 <w:color w:val="000000"/>
                 <w:sz w:val="21"/>
               </w:rPr>
-              <w:t>（2）跨厂信息过滤：筛选满足 IsTransferLot=True，或 IsTransferLot≠True 且 processingstatus≠'CrossFabTransferred' 的 Lot。IsTransferLot 指标沿用 istransferlot Macro 判断；本需求不新增 FAB6/FAB8 跨厂资料去重规则。</w:t>
+              <w:t>（2）跨厂信息去重：筛选出满足 IsTransferLot =True 或（IsTransferLot ≠ True 且 processingStatus ≠ 'CrossFabTransferred'）的 Lot。（IsTransferLot 指标经 istransferlot marco 判断得到）</w:t>
             </w:r>
           </w:p>
           <w:p>
             <w:pPr>
               <w:keepNext/>
-              <w:spacing w:before="80" w:after="40" w:line="360" w:lineRule="auto"/>
+              <w:spacing w:before="60" w:after="20" w:line="312" w:lineRule="auto"/>
               <w:jc w:val="left"/>
             </w:pPr>
             <w:r>
@@ -885,13 +900,13 @@
                 <w:color w:val="000000"/>
                 <w:sz w:val="21"/>
               </w:rPr>
-              <w:t>1.2 获取Pirun站点并对Lot进一步过滤</w:t>
+              <w:t>1.2 获取Pirun站点并对lot进一步过滤</w:t>
             </w:r>
           </w:p>
           <w:p>
             <w:pPr>
               <w:keepNext w:val="0"/>
-              <w:spacing w:before="0" w:after="40" w:line="360" w:lineRule="auto"/>
+              <w:spacing w:before="0" w:after="40" w:line="312" w:lineRule="auto"/>
               <w:ind w:firstLine="420"/>
               <w:jc w:val="both"/>
             </w:pPr>
@@ -903,13 +918,13 @@
                 <w:color w:val="000000"/>
                 <w:sz w:val="21"/>
               </w:rPr>
-              <w:t>获取 Lot 后续站点信息并进一步判断是否符合 AutoPirun 条件。</w:t>
+              <w:t>获取 Lot 后续站点信息并进一步判断是否符合AutoPirun条件。</w:t>
             </w:r>
           </w:p>
           <w:p>
             <w:pPr>
               <w:keepNext/>
-              <w:spacing w:before="60" w:after="40" w:line="360" w:lineRule="auto"/>
+              <w:spacing w:before="40" w:after="20" w:line="312" w:lineRule="auto"/>
               <w:jc w:val="left"/>
             </w:pPr>
             <w:r>
@@ -926,7 +941,7 @@
           <w:p>
             <w:pPr>
               <w:keepNext w:val="0"/>
-              <w:spacing w:before="0" w:after="40" w:line="360" w:lineRule="auto"/>
+              <w:spacing w:before="0" w:after="40" w:line="312" w:lineRule="auto"/>
               <w:ind w:firstLine="420"/>
               <w:jc w:val="both"/>
             </w:pPr>
@@ -938,13 +953,13 @@
                 <w:color w:val="000000"/>
                 <w:sz w:val="21"/>
               </w:rPr>
-              <w:t>对通过 1.1 筛选的 Lot，向下 Fetch 20 个站点，获取每个站点的 productname、planname、stage、capability、stepseq、recipeid、STN 信息（Transfer Lot 沿用现有厂别修正规则）。将 Fetch 的站点截取到相同 Stage 最后一道 CD 站点，Lot 当前站点到最后一道 CD 站点之间的区段定义为 PirunLoop。若 Fetch 站点中无 CD 站点，则过滤该 Lot。</w:t>
+              <w:t>对通过 1.1 筛选的 Lot，向下 Fetch 20 站，获取每个站点的 productname、planname、stage、capability、stepseq、recipeid、STN 信息(Transferlot 需修正厂别)。将 Fetch 的站点截取到同 Stage 最后一道 CD 站点，Lot 当前站点到最后一道 CD 站点即为一段 PirunLoop。若 lot Fetch 站点中无 CD 站点，则过滤该 Lot。</w:t>
             </w:r>
           </w:p>
           <w:p>
             <w:pPr>
               <w:keepNext/>
-              <w:spacing w:before="60" w:after="40" w:line="360" w:lineRule="auto"/>
+              <w:spacing w:before="40" w:after="20" w:line="312" w:lineRule="auto"/>
               <w:jc w:val="left"/>
             </w:pPr>
             <w:r>
@@ -961,7 +976,7 @@
           <w:p>
             <w:pPr>
               <w:keepNext w:val="0"/>
-              <w:spacing w:before="0" w:after="20" w:line="360" w:lineRule="auto"/>
+              <w:spacing w:before="0" w:after="20" w:line="312" w:lineRule="auto"/>
               <w:ind w:left="420"/>
               <w:jc w:val="both"/>
             </w:pPr>
@@ -973,13 +988,13 @@
                 <w:color w:val="000000"/>
                 <w:sz w:val="21"/>
               </w:rPr>
-              <w:t>（1）Litho站点判断：PirunLoop 中必须存在 capability=LithoCapability 且含有 Reticle 信息的站点；若无则过滤 Lot。</w:t>
+              <w:t>（1）Litho 站点判断：判断 PirunLoop 中是否存在 capability =LithoCapability 且含有 Reticle 信息的站点。若无则过滤 Lot。</w:t>
             </w:r>
           </w:p>
           <w:p>
             <w:pPr>
               <w:keepNext w:val="0"/>
-              <w:spacing w:before="0" w:after="20" w:line="360" w:lineRule="auto"/>
+              <w:spacing w:before="0" w:after="20" w:line="312" w:lineRule="auto"/>
               <w:ind w:left="420"/>
               <w:jc w:val="both"/>
             </w:pPr>
@@ -991,13 +1006,13 @@
                 <w:color w:val="000000"/>
                 <w:sz w:val="21"/>
               </w:rPr>
-              <w:t>（2）Specify判断：按 productid、layer、lotid 匹配 r2r_litho_whitelist；命中时沿用现有 Specify Lot 处理。</w:t>
+              <w:t>（2）Specify 判断：判断 lot 是否在 r2r_litho_whitelist（匹配 productid，layer，lotid）中，若在则沿用现有 Specify Lot 处理。</w:t>
             </w:r>
           </w:p>
           <w:p>
             <w:pPr>
               <w:keepNext w:val="0"/>
-              <w:spacing w:before="0" w:after="20" w:line="360" w:lineRule="auto"/>
+              <w:spacing w:before="0" w:after="20" w:line="312" w:lineRule="auto"/>
               <w:ind w:left="420"/>
               <w:jc w:val="both"/>
             </w:pPr>
@@ -1009,13 +1024,13 @@
                 <w:color w:val="000000"/>
                 <w:sz w:val="21"/>
               </w:rPr>
-              <w:t>（3）同FOUP Pilot判断：从 rtd_r2r_litho_context_ovlcd 和 rtd_r2r_lot_history 获取 Litho Pilot，若同 FOUP 中已有 Litho Pilot，则过滤 Lot。</w:t>
+              <w:t>（3）同 Foup Pilot 判断：从表 rtd_r2r_litho_context_ovlcd 和 rtd_r2r_lot_history 获取 Litho Pilot，判断同 Foup 中是否有 Litho Pilot，若有则过滤 Lot。</w:t>
             </w:r>
           </w:p>
           <w:p>
             <w:pPr>
               <w:keepNext w:val="0"/>
-              <w:spacing w:before="0" w:after="20" w:line="360" w:lineRule="auto"/>
+              <w:spacing w:before="0" w:after="20" w:line="312" w:lineRule="auto"/>
               <w:ind w:left="420"/>
               <w:jc w:val="both"/>
             </w:pPr>
@@ -1027,13 +1042,13 @@
                 <w:color w:val="000000"/>
                 <w:sz w:val="21"/>
               </w:rPr>
-              <w:t>（4）FutureHold判断：从 fabfutureaction 获取 PirunLoop 各站点的 FutureAction；若存在 FutureHold，则过滤 Lot。</w:t>
+              <w:t>（4）FutureHold 判断：从表 fabfutureaction 获取 PirunLoop 中每个站点的 FutureAction 信息，判断 Loop 中是否存在 FutureHold，若有则过滤 Lot。</w:t>
             </w:r>
           </w:p>
           <w:p>
             <w:pPr>
               <w:keepNext w:val="0"/>
-              <w:spacing w:before="0" w:after="20" w:line="360" w:lineRule="auto"/>
+              <w:spacing w:before="0" w:after="20" w:line="312" w:lineRule="auto"/>
               <w:ind w:left="420"/>
               <w:jc w:val="both"/>
             </w:pPr>
@@ -1045,13 +1060,13 @@
                 <w:color w:val="000000"/>
                 <w:sz w:val="21"/>
               </w:rPr>
-              <w:t>（5）RC判断：若 PirunLoop 中存在 RC 站点，则过滤 Lot。</w:t>
+              <w:t>（5）RC 判断：判断 PirunLoop 中是否存在 RC站点，若有则过滤 Lot。</w:t>
             </w:r>
           </w:p>
           <w:p>
             <w:pPr>
               <w:keepNext/>
-              <w:spacing w:before="80" w:after="40" w:line="360" w:lineRule="auto"/>
+              <w:spacing w:before="60" w:after="20" w:line="312" w:lineRule="auto"/>
               <w:jc w:val="left"/>
             </w:pPr>
             <w:r>
@@ -1068,7 +1083,7 @@
           <w:p>
             <w:pPr>
               <w:keepNext w:val="0"/>
-              <w:spacing w:before="0" w:after="40" w:line="360" w:lineRule="auto"/>
+              <w:spacing w:before="0" w:after="40" w:line="312" w:lineRule="auto"/>
               <w:ind w:firstLine="420"/>
               <w:jc w:val="both"/>
             </w:pPr>
@@ -1080,13 +1095,13 @@
                 <w:color w:val="000000"/>
                 <w:sz w:val="21"/>
               </w:rPr>
-              <w:t>获取 Lot 在可作业机台的 R2R 状态，并判断 Lot 是否存在多路径。</w:t>
+              <w:t>获取lot在可作业机台的R2R 状态，并判断lot是否存在多路径。</w:t>
             </w:r>
           </w:p>
           <w:p>
             <w:pPr>
               <w:keepNext/>
-              <w:spacing w:before="60" w:after="40" w:line="360" w:lineRule="auto"/>
+              <w:spacing w:before="40" w:after="20" w:line="312" w:lineRule="auto"/>
               <w:jc w:val="left"/>
             </w:pPr>
             <w:r>
@@ -1103,7 +1118,7 @@
           <w:p>
             <w:pPr>
               <w:keepNext w:val="0"/>
-              <w:spacing w:before="0" w:after="40" w:line="360" w:lineRule="auto"/>
+              <w:spacing w:before="0" w:after="40" w:line="312" w:lineRule="auto"/>
               <w:ind w:firstLine="420"/>
               <w:jc w:val="both"/>
             </w:pPr>
@@ -1115,13 +1130,13 @@
                 <w:color w:val="000000"/>
                 <w:sz w:val="21"/>
               </w:rPr>
-              <w:t>获取 1.2 中 Lot 的 Litho 站点。经现有 Transfer Macro 判断后，若 Lot 在 Litho 站点能够 Transfer，则同时获取对应工厂的 Litho 机台。</w:t>
+              <w:t>拿取 1.2 中 Lot 的 Litho 站点，经 TransferMarco 判断后，若 Lot 在 Litho 站点能 Transfer 则同时拿取对厂 Litho 机台。</w:t>
             </w:r>
           </w:p>
           <w:p>
             <w:pPr>
               <w:keepNext w:val="0"/>
-              <w:spacing w:before="0" w:after="40" w:line="360" w:lineRule="auto"/>
+              <w:spacing w:before="0" w:after="40" w:line="312" w:lineRule="auto"/>
               <w:ind w:firstLine="420"/>
               <w:jc w:val="both"/>
             </w:pPr>
@@ -1133,13 +1148,13 @@
                 <w:color w:val="000000"/>
                 <w:sz w:val="21"/>
               </w:rPr>
-              <w:t>按机台厂别从 rtd_r2r_litho_add_setting 获取 Pi_split_flag 和 pi_splitcnt。若 Lot 不存在 Pi_split_flag='Y' 的可作业机台，则过滤 Lot。</w:t>
+              <w:t>By 机台厂别从表 rtd_r2r_litho_add_setting 中获取 Lot 在机台的 Pi_split flag 和 pi_splitcnt。若 Lot 不存在 Pi_split flag = 'Y' 的机台，则过滤 Lot。</w:t>
             </w:r>
           </w:p>
           <w:p>
             <w:pPr>
               <w:keepNext w:val="0"/>
-              <w:spacing w:before="0" w:after="40" w:line="360" w:lineRule="auto"/>
+              <w:spacing w:before="0" w:after="40" w:line="312" w:lineRule="auto"/>
               <w:ind w:firstLine="420"/>
               <w:jc w:val="both"/>
             </w:pPr>
@@ -1151,13 +1166,13 @@
                 <w:color w:val="000000"/>
                 <w:sz w:val="21"/>
               </w:rPr>
-              <w:t>剩余机台继续经过 EQPStatus、LCC、Capability、Recipe、PPID、Global Reason 判断；若存在卡控，则剔除对应机台。</w:t>
+              <w:t>将剩余 lot 在 Litho 站点的机台经过 EQPStatus、LCC、Capability、Recipe、PPID、Global Reason 判断，若存在卡控则筛除对应机台。</w:t>
             </w:r>
           </w:p>
           <w:p>
             <w:pPr>
               <w:keepNext/>
-              <w:spacing w:before="60" w:after="40" w:line="360" w:lineRule="auto"/>
+              <w:spacing w:before="40" w:after="20" w:line="312" w:lineRule="auto"/>
               <w:jc w:val="left"/>
             </w:pPr>
             <w:r>
@@ -1174,7 +1189,7 @@
           <w:p>
             <w:pPr>
               <w:keepNext w:val="0"/>
-              <w:spacing w:before="0" w:after="40" w:line="360" w:lineRule="auto"/>
+              <w:spacing w:before="0" w:after="40" w:line="312" w:lineRule="auto"/>
               <w:ind w:firstLine="420"/>
               <w:jc w:val="both"/>
             </w:pPr>
@@ -1186,13 +1201,13 @@
                 <w:color w:val="000000"/>
                 <w:sz w:val="21"/>
               </w:rPr>
-              <w:t>按 Lot+STN+Reticle 维度从 rtd_r2r_litho_context_ovl 和 rtd_r2r_litho_context_cd 匹配 R2R 状态。保留 OVL_Status、CD_Status 属于 PIRUNON、ON、Fixed，且不存在 R2R Reason 的 Context。</w:t>
+              <w:t>By Lot+STN+Reticle 维度从表 rtd_r2r_litho_context_ovl 和 rtd_r2r_litho_context_cd 匹配 R2R 状态，并判断是否存在 R2R Reason。筛选出满足：OVL_Status In(PIRUNON，ON，Fixed)且 CD_Status In(PIRUNON，ON，Fixed)且无 R2R Reason 的 Context (By Lot+STN+Reticle)。</w:t>
             </w:r>
           </w:p>
           <w:p>
             <w:pPr>
               <w:keepNext w:val="0"/>
-              <w:spacing w:before="0" w:after="40" w:line="360" w:lineRule="auto"/>
+              <w:spacing w:before="0" w:after="40" w:line="312" w:lineRule="auto"/>
               <w:ind w:firstLine="420"/>
               <w:jc w:val="both"/>
             </w:pPr>
@@ -1204,13 +1219,13 @@
                 <w:color w:val="000000"/>
                 <w:sz w:val="21"/>
               </w:rPr>
-              <w:t>按 Lot 统计有效 Context 数量。若 ContextCount&gt;1，则判定 Lot 存在多路径并过滤该 Lot。</w:t>
+              <w:t>By Lot 统计符合上述条件的 Context 数量，若 ContextCount&gt;1，则认为 Lot 存在多路径，过滤该 Lot。</w:t>
             </w:r>
           </w:p>
           <w:p>
             <w:pPr>
               <w:keepNext/>
-              <w:spacing w:before="80" w:after="40" w:line="360" w:lineRule="auto"/>
+              <w:spacing w:before="60" w:after="20" w:line="312" w:lineRule="auto"/>
               <w:jc w:val="left"/>
             </w:pPr>
             <w:r>
@@ -1227,7 +1242,7 @@
           <w:p>
             <w:pPr>
               <w:keepNext w:val="0"/>
-              <w:spacing w:before="0" w:after="40" w:line="360" w:lineRule="auto"/>
+              <w:spacing w:before="0" w:after="40" w:line="312" w:lineRule="auto"/>
               <w:ind w:firstLine="420"/>
               <w:jc w:val="both"/>
             </w:pPr>
@@ -1239,13 +1254,13 @@
                 <w:color w:val="000000"/>
                 <w:sz w:val="21"/>
               </w:rPr>
-              <w:t>按 Context 为 Lot 排序并挑选最优 Lot。</w:t>
+              <w:t>By Context 为 Lot 排序并挑选最优 Lot。</w:t>
             </w:r>
           </w:p>
           <w:p>
             <w:pPr>
               <w:keepNext/>
-              <w:spacing w:before="60" w:after="40" w:line="360" w:lineRule="auto"/>
+              <w:spacing w:before="40" w:after="20" w:line="312" w:lineRule="auto"/>
               <w:jc w:val="left"/>
             </w:pPr>
             <w:r>
@@ -1262,7 +1277,7 @@
           <w:p>
             <w:pPr>
               <w:keepNext w:val="0"/>
-              <w:spacing w:before="0" w:after="40" w:line="360" w:lineRule="auto"/>
+              <w:spacing w:before="0" w:after="40" w:line="312" w:lineRule="auto"/>
               <w:ind w:firstLine="420"/>
               <w:jc w:val="both"/>
             </w:pPr>
@@ -1280,7 +1295,7 @@
           <w:p>
             <w:pPr>
               <w:keepNext w:val="0"/>
-              <w:spacing w:before="0" w:after="40" w:line="360" w:lineRule="auto"/>
+              <w:spacing w:before="0" w:after="40" w:line="312" w:lineRule="auto"/>
               <w:ind w:firstLine="420"/>
               <w:jc w:val="both"/>
             </w:pPr>
@@ -1292,13 +1307,13 @@
                 <w:color w:val="000000"/>
                 <w:sz w:val="21"/>
               </w:rPr>
-              <w:t>筛选 Pi_split_flag='Y'，且 Pilot_CD 为空或 Pilot_OVL 为空的 Context，作为需要自动 Pirun 的 Context。</w:t>
+              <w:t>筛选出满足 Pi_split_flag='Y'且(Pilot_CD 为 Null 或 Pilot_OVL 为 Null)的 Context，即为需要自动 Pirun 的 Context。</w:t>
             </w:r>
           </w:p>
           <w:p>
             <w:pPr>
               <w:keepNext/>
-              <w:spacing w:before="60" w:after="40" w:line="360" w:lineRule="auto"/>
+              <w:spacing w:before="40" w:after="20" w:line="312" w:lineRule="auto"/>
               <w:jc w:val="left"/>
             </w:pPr>
             <w:r>
@@ -1315,7 +1330,7 @@
           <w:p>
             <w:pPr>
               <w:keepNext w:val="0"/>
-              <w:spacing w:before="0" w:after="40" w:line="360" w:lineRule="auto"/>
+              <w:spacing w:before="0" w:after="40" w:line="312" w:lineRule="auto"/>
               <w:ind w:firstLine="420"/>
               <w:jc w:val="both"/>
             </w:pPr>
@@ -1327,13 +1342,13 @@
                 <w:color w:val="000000"/>
                 <w:sz w:val="21"/>
               </w:rPr>
-              <w:t>获取 Lot 的排序指标：</w:t>
+              <w:t>获取 lot 的排序指标</w:t>
             </w:r>
           </w:p>
           <w:p>
             <w:pPr>
               <w:keepNext w:val="0"/>
-              <w:spacing w:before="0" w:after="20" w:line="360" w:lineRule="auto"/>
+              <w:spacing w:before="0" w:after="20" w:line="312" w:lineRule="auto"/>
               <w:ind w:left="420"/>
               <w:jc w:val="both"/>
             </w:pPr>
@@ -1345,13 +1360,13 @@
                 <w:color w:val="000000"/>
                 <w:sz w:val="21"/>
               </w:rPr>
-              <w:t>（1）GapToLitho：Lot 当前站点距 Litho 站点的剩余 Step 数量。</w:t>
+              <w:t>（1）计算 Lot 当前站点距 Litho 站点的剩余 Step 数量，记为 GapToLitho；</w:t>
             </w:r>
           </w:p>
           <w:p>
             <w:pPr>
               <w:keepNext w:val="0"/>
-              <w:spacing w:before="0" w:after="20" w:line="360" w:lineRule="auto"/>
+              <w:spacing w:before="0" w:after="20" w:line="312" w:lineRule="auto"/>
               <w:ind w:left="420"/>
               <w:jc w:val="both"/>
             </w:pPr>
@@ -1363,13 +1378,13 @@
                 <w:color w:val="000000"/>
                 <w:sz w:val="21"/>
               </w:rPr>
-              <w:t>（2）SplitCntMatched：componentqty≥pi_splitcnt 时为 1，否则为 0。pi_splitcnt 为空、等于 0、小于 0 或大于 25 时使用默认值 4。</w:t>
+              <w:t>（2）判断 Lot 的片数是否大于等于 Pi_splitcnt（默认为4），若是则 SplitCntMatched=1，否则为0；Pi_splitcnt 为空、为0、为负数或大于25时使用默认值4；</w:t>
             </w:r>
           </w:p>
           <w:p>
             <w:pPr>
               <w:keepNext w:val="0"/>
-              <w:spacing w:before="0" w:after="20" w:line="360" w:lineRule="auto"/>
+              <w:spacing w:before="0" w:after="20" w:line="312" w:lineRule="auto"/>
               <w:ind w:left="420"/>
               <w:jc w:val="both"/>
             </w:pPr>
@@ -1381,13 +1396,13 @@
                 <w:color w:val="000000"/>
                 <w:sz w:val="21"/>
               </w:rPr>
-              <w:t>（3）RequiredChuckCount：Lot 存在 prelayer 时，从 r2r_litho_waferhistory 获取 Wafer 的 Chuck 信息；否则从 fsmaterialassociation 获取 Wafer 的 Slot 信息。C1、C2 各至少 2 片，或奇数、偶数 Slot 各至少 2 片时为 1，否则为 0。</w:t>
+              <w:t>（3）若 Lot 存在 prelayer，则从表 r2r_litho_waferhistory 中获取每片 Wafer 的 Chuck 信息；否则从表 fsmaterialassociation 中获取 Wafer 的 Slot 信息。判断 Lot 是否满足包含 C1/C2（或 Slot 奇/偶）各大于等于两片，若是则 RequiredChuckCount=1，否则为0；</w:t>
             </w:r>
           </w:p>
           <w:p>
             <w:pPr>
               <w:keepNext w:val="0"/>
-              <w:spacing w:before="0" w:after="20" w:line="360" w:lineRule="auto"/>
+              <w:spacing w:before="0" w:after="20" w:line="312" w:lineRule="auto"/>
               <w:ind w:left="420"/>
               <w:jc w:val="both"/>
             </w:pPr>
@@ -1399,13 +1414,13 @@
                 <w:color w:val="000000"/>
                 <w:sz w:val="21"/>
               </w:rPr>
-              <w:t>（4）BulletLot：沿用现有逻辑判断 Lot 是否为空扣或空 LP Lot；是为 1，否则为 0。</w:t>
+              <w:t>（4）判断 Lot 是否为空扣/空 Lp Lot，若是则 BulletLot=1，否则为0；</w:t>
             </w:r>
           </w:p>
           <w:p>
             <w:pPr>
               <w:keepNext w:val="0"/>
-              <w:spacing w:before="0" w:after="20" w:line="360" w:lineRule="auto"/>
+              <w:spacing w:before="0" w:after="20" w:line="312" w:lineRule="auto"/>
               <w:ind w:left="420"/>
               <w:jc w:val="both"/>
             </w:pPr>
@@ -1417,13 +1432,13 @@
                 <w:color w:val="000000"/>
                 <w:sz w:val="21"/>
               </w:rPr>
-              <w:t>（5）RemainQ：RemainQ 有值且大于 0 时取 Lot 实际剩余 Queue Time；空值按 9999 h。</w:t>
+              <w:t>（5）若 Lot RemainQ 有值且大于0，则指标 RemainQ 为 lot 剩余 Qtime，否则为9999；</w:t>
             </w:r>
           </w:p>
           <w:p>
             <w:pPr>
               <w:keepNext w:val="0"/>
-              <w:spacing w:before="0" w:after="20" w:line="360" w:lineRule="auto"/>
+              <w:spacing w:before="0" w:after="20" w:line="312" w:lineRule="auto"/>
               <w:ind w:left="420"/>
               <w:jc w:val="both"/>
             </w:pPr>
@@ -1435,13 +1450,13 @@
                 <w:color w:val="000000"/>
                 <w:sz w:val="21"/>
               </w:rPr>
-              <w:t>（6）KeyLot：quota_applyinfo 中 KeyLot=1 且 Status='CONFIRM' 时为 1，否则为 0。</w:t>
+              <w:t>（6）若 Lot 在表 quota_applyinfo 中且 KeyLot=1 且 Status=CONFIRM，则指标 KeyLot=1，否则为0。</w:t>
             </w:r>
           </w:p>
           <w:p>
             <w:pPr>
               <w:keepNext w:val="0"/>
-              <w:spacing w:before="0" w:after="40" w:line="360" w:lineRule="auto"/>
+              <w:spacing w:before="0" w:after="40" w:line="312" w:lineRule="auto"/>
               <w:ind w:firstLine="420"/>
               <w:jc w:val="both"/>
             </w:pPr>
@@ -1453,13 +1468,13 @@
                 <w:color w:val="000000"/>
                 <w:sz w:val="21"/>
               </w:rPr>
-              <w:t>按以下优先级对 Lot 排序，记为 RTDRank：</w:t>
+              <w:t>按以下优先级对 Lot 排序，并记为 RTDRank：</w:t>
             </w:r>
           </w:p>
           <w:p>
             <w:pPr>
               <w:keepNext w:val="0"/>
-              <w:spacing w:before="0" w:after="20" w:line="360" w:lineRule="auto"/>
+              <w:spacing w:before="0" w:after="20" w:line="312" w:lineRule="auto"/>
               <w:ind w:left="630"/>
               <w:jc w:val="both"/>
             </w:pPr>
@@ -1471,13 +1486,13 @@
                 <w:color w:val="000000"/>
                 <w:sz w:val="21"/>
               </w:rPr>
-              <w:t>① GapToLitho ASC</w:t>
+              <w:t>①Min(GapToLitho)</w:t>
             </w:r>
           </w:p>
           <w:p>
             <w:pPr>
               <w:keepNext w:val="0"/>
-              <w:spacing w:before="0" w:after="20" w:line="360" w:lineRule="auto"/>
+              <w:spacing w:before="0" w:after="20" w:line="312" w:lineRule="auto"/>
               <w:ind w:left="630"/>
               <w:jc w:val="both"/>
             </w:pPr>
@@ -1489,13 +1504,13 @@
                 <w:color w:val="000000"/>
                 <w:sz w:val="21"/>
               </w:rPr>
-              <w:t>② SplitCntMatched DESC</w:t>
+              <w:t>②Max(SplitCntMatched)</w:t>
             </w:r>
           </w:p>
           <w:p>
             <w:pPr>
               <w:keepNext w:val="0"/>
-              <w:spacing w:before="0" w:after="20" w:line="360" w:lineRule="auto"/>
+              <w:spacing w:before="0" w:after="20" w:line="312" w:lineRule="auto"/>
               <w:ind w:left="630"/>
               <w:jc w:val="both"/>
             </w:pPr>
@@ -1507,13 +1522,13 @@
                 <w:color w:val="000000"/>
                 <w:sz w:val="21"/>
               </w:rPr>
-              <w:t>③ RequiredChuckCount DESC</w:t>
+              <w:t>③Max(RequiredChuckCount)</w:t>
             </w:r>
           </w:p>
           <w:p>
             <w:pPr>
               <w:keepNext w:val="0"/>
-              <w:spacing w:before="0" w:after="20" w:line="360" w:lineRule="auto"/>
+              <w:spacing w:before="0" w:after="20" w:line="312" w:lineRule="auto"/>
               <w:ind w:left="630"/>
               <w:jc w:val="both"/>
             </w:pPr>
@@ -1525,13 +1540,13 @@
                 <w:color w:val="000000"/>
                 <w:sz w:val="21"/>
               </w:rPr>
-              <w:t>④ BulletLot DESC</w:t>
+              <w:t>④Max(BulletLot)</w:t>
             </w:r>
           </w:p>
           <w:p>
             <w:pPr>
               <w:keepNext w:val="0"/>
-              <w:spacing w:before="0" w:after="20" w:line="360" w:lineRule="auto"/>
+              <w:spacing w:before="0" w:after="20" w:line="312" w:lineRule="auto"/>
               <w:ind w:left="630"/>
               <w:jc w:val="both"/>
             </w:pPr>
@@ -1543,13 +1558,13 @@
                 <w:color w:val="000000"/>
                 <w:sz w:val="21"/>
               </w:rPr>
-              <w:t>⑤ RemainQ ASC</w:t>
+              <w:t>⑤Min(RemainQ)</w:t>
             </w:r>
           </w:p>
           <w:p>
             <w:pPr>
               <w:keepNext w:val="0"/>
-              <w:spacing w:before="0" w:after="20" w:line="360" w:lineRule="auto"/>
+              <w:spacing w:before="0" w:after="20" w:line="312" w:lineRule="auto"/>
               <w:ind w:left="630"/>
               <w:jc w:val="both"/>
             </w:pPr>
@@ -1561,13 +1576,13 @@
                 <w:color w:val="000000"/>
                 <w:sz w:val="21"/>
               </w:rPr>
-              <w:t>⑥ KeyLot ASC</w:t>
+              <w:t>⑥Min(KeyLot)</w:t>
             </w:r>
           </w:p>
           <w:p>
             <w:pPr>
               <w:keepNext w:val="0"/>
-              <w:spacing w:before="0" w:after="20" w:line="360" w:lineRule="auto"/>
+              <w:spacing w:before="0" w:after="20" w:line="312" w:lineRule="auto"/>
               <w:ind w:left="630"/>
               <w:jc w:val="both"/>
             </w:pPr>
@@ -1579,13 +1594,13 @@
                 <w:color w:val="000000"/>
                 <w:sz w:val="21"/>
               </w:rPr>
-              <w:t>⑦ lotid ASC（最终 Tie-breaker）</w:t>
+              <w:t>⑦Min(lotid)</w:t>
             </w:r>
           </w:p>
           <w:p>
             <w:pPr>
               <w:keepNext/>
-              <w:spacing w:before="60" w:after="40" w:line="360" w:lineRule="auto"/>
+              <w:spacing w:before="40" w:after="20" w:line="312" w:lineRule="auto"/>
               <w:jc w:val="left"/>
             </w:pPr>
             <w:r>
@@ -1596,13 +1611,13 @@
                 <w:color w:val="000000"/>
                 <w:sz w:val="21"/>
               </w:rPr>
-              <w:t>1.4.3 Context之间排序</w:t>
+              <w:t>1.4.2 Context 之间排序</w:t>
             </w:r>
           </w:p>
           <w:p>
             <w:pPr>
               <w:keepNext w:val="0"/>
-              <w:spacing w:before="0" w:after="40" w:line="360" w:lineRule="auto"/>
+              <w:spacing w:before="0" w:after="40" w:line="312" w:lineRule="auto"/>
               <w:ind w:firstLine="420"/>
               <w:jc w:val="both"/>
             </w:pPr>
@@ -1614,13 +1629,31 @@
                 <w:color w:val="000000"/>
                 <w:sz w:val="21"/>
               </w:rPr>
-              <w:t>Lot 存在多个 Pirun Context 时，为尽量将使用同一 Reticle 的 Lot 分配到同一机台，并使不同 Reticle 的 Lot 均衡分配，需要对 Context 进行排序。</w:t>
+              <w:t>Lot 存在多个 Pirun Context时，为实现使用同一 Reticle 的Lot尽量分配到同一机台，不同 Reticle 的 lot 均衡分配，需要对 Context 进行排序。</w:t>
             </w:r>
           </w:p>
           <w:p>
             <w:pPr>
               <w:keepNext w:val="0"/>
-              <w:spacing w:before="0" w:after="20" w:line="360" w:lineRule="auto"/>
+              <w:spacing w:before="0" w:after="40" w:line="312" w:lineRule="auto"/>
+              <w:ind w:firstLine="420"/>
+              <w:jc w:val="both"/>
+            </w:pPr>
+            <w:r>
+              <w:rPr>
+                <w:rFonts w:ascii="Times New Roman" w:hAnsi="Times New Roman" w:eastAsia="SimSun" w:cs="Times New Roman"/>
+                <w:b w:val="0"/>
+                <w:i w:val="0"/>
+                <w:color w:val="000000"/>
+                <w:sz w:val="21"/>
+              </w:rPr>
+              <w:t>Context 排序指标：</w:t>
+            </w:r>
+          </w:p>
+          <w:p>
+            <w:pPr>
+              <w:keepNext w:val="0"/>
+              <w:spacing w:before="0" w:after="20" w:line="312" w:lineRule="auto"/>
               <w:ind w:left="420"/>
               <w:jc w:val="both"/>
             </w:pPr>
@@ -1632,13 +1665,13 @@
                 <w:color w:val="000000"/>
                 <w:sz w:val="21"/>
               </w:rPr>
-              <w:t>（1）ReticleSTNRank：按 Reticle+STN 对 Context 分组并获取 ReticleOnSTN。第一轮优先 STN=ReticleOnSTN 的 Context；后续轮次优先与上一轮已选 Context 属于同一 Reticle+STN 分组的 Context。</w:t>
+              <w:t>（1）By Reticle+STN 给 Context 分组，获取 Reticle 当前所在机台信息 ReticleOnSTN，循环前，若 Context 的 STN=ReticleOnSTN，则 ReticleSTNRank=1；循环中，若 Context 与上轮排序第一的 Context 属于同一组，则 ReticleSTNRank=1，否则为0。</w:t>
             </w:r>
           </w:p>
           <w:p>
             <w:pPr>
               <w:keepNext w:val="0"/>
-              <w:spacing w:before="0" w:after="20" w:line="360" w:lineRule="auto"/>
+              <w:spacing w:before="0" w:after="20" w:line="312" w:lineRule="auto"/>
               <w:ind w:left="420"/>
               <w:jc w:val="both"/>
             </w:pPr>
@@ -1650,13 +1683,13 @@
                 <w:color w:val="000000"/>
                 <w:sz w:val="21"/>
               </w:rPr>
-              <w:t>（2）ContextCandidateCount：统计 Context 内当前可选 Lot 数量。</w:t>
+              <w:t>（2）统计 Context 内当前可选 Lot 的数量，记作 ContextCandidateCount。</w:t>
             </w:r>
           </w:p>
           <w:p>
             <w:pPr>
               <w:keepNext w:val="0"/>
-              <w:spacing w:before="0" w:after="20" w:line="360" w:lineRule="auto"/>
+              <w:spacing w:before="0" w:after="20" w:line="312" w:lineRule="auto"/>
               <w:ind w:left="420"/>
               <w:jc w:val="both"/>
             </w:pPr>
@@ -1668,13 +1701,13 @@
                 <w:color w:val="000000"/>
                 <w:sz w:val="21"/>
               </w:rPr>
-              <w:t>（3）ActualSTNPilotCount：按 STN 统计已经选择 Pilot 的 Context 数量。</w:t>
+              <w:t>（3）By STN 统计已选择 Pilot 的 Context 数量，记作 ActualSTNPilotCount。</w:t>
             </w:r>
           </w:p>
           <w:p>
             <w:pPr>
               <w:keepNext w:val="0"/>
-              <w:spacing w:before="0" w:after="40" w:line="360" w:lineRule="auto"/>
+              <w:spacing w:before="0" w:after="40" w:line="312" w:lineRule="auto"/>
               <w:ind w:firstLine="420"/>
               <w:jc w:val="both"/>
             </w:pPr>
@@ -1686,13 +1719,85 @@
                 <w:color w:val="000000"/>
                 <w:sz w:val="21"/>
               </w:rPr>
-              <w:t>最终按 ReticleSTNRank DESC、ContextCandidateCount ASC、ActualSTNPilotCount ASC、RTDRank ASC 对 Lot+Context 排序。</w:t>
+              <w:t>最终按以下优先级对 Lot +Context 排序：</w:t>
+            </w:r>
+          </w:p>
+          <w:p>
+            <w:pPr>
+              <w:keepNext w:val="0"/>
+              <w:spacing w:before="0" w:after="20" w:line="312" w:lineRule="auto"/>
+              <w:ind w:left="630"/>
+              <w:jc w:val="both"/>
+            </w:pPr>
+            <w:r>
+              <w:rPr>
+                <w:rFonts w:ascii="Times New Roman" w:hAnsi="Times New Roman" w:eastAsia="SimSun" w:cs="Times New Roman"/>
+                <w:b w:val="0"/>
+                <w:i w:val="0"/>
+                <w:color w:val="000000"/>
+                <w:sz w:val="21"/>
+              </w:rPr>
+              <w:t>① Max(ReticleSTNRank)</w:t>
+            </w:r>
+          </w:p>
+          <w:p>
+            <w:pPr>
+              <w:keepNext w:val="0"/>
+              <w:spacing w:before="0" w:after="20" w:line="312" w:lineRule="auto"/>
+              <w:ind w:left="630"/>
+              <w:jc w:val="both"/>
+            </w:pPr>
+            <w:r>
+              <w:rPr>
+                <w:rFonts w:ascii="Times New Roman" w:hAnsi="Times New Roman" w:eastAsia="SimSun" w:cs="Times New Roman"/>
+                <w:b w:val="0"/>
+                <w:i w:val="0"/>
+                <w:color w:val="000000"/>
+                <w:sz w:val="21"/>
+              </w:rPr>
+              <w:t>② Min(ContextCandidateCount)</w:t>
+            </w:r>
+          </w:p>
+          <w:p>
+            <w:pPr>
+              <w:keepNext w:val="0"/>
+              <w:spacing w:before="0" w:after="20" w:line="312" w:lineRule="auto"/>
+              <w:ind w:left="630"/>
+              <w:jc w:val="both"/>
+            </w:pPr>
+            <w:r>
+              <w:rPr>
+                <w:rFonts w:ascii="Times New Roman" w:hAnsi="Times New Roman" w:eastAsia="SimSun" w:cs="Times New Roman"/>
+                <w:b w:val="0"/>
+                <w:i w:val="0"/>
+                <w:color w:val="000000"/>
+                <w:sz w:val="21"/>
+              </w:rPr>
+              <w:t>③ Min(ActualSTNPilotCount)</w:t>
+            </w:r>
+          </w:p>
+          <w:p>
+            <w:pPr>
+              <w:keepNext w:val="0"/>
+              <w:spacing w:before="0" w:after="20" w:line="312" w:lineRule="auto"/>
+              <w:ind w:left="630"/>
+              <w:jc w:val="both"/>
+            </w:pPr>
+            <w:r>
+              <w:rPr>
+                <w:rFonts w:ascii="Times New Roman" w:hAnsi="Times New Roman" w:eastAsia="SimSun" w:cs="Times New Roman"/>
+                <w:b w:val="0"/>
+                <w:i w:val="0"/>
+                <w:color w:val="000000"/>
+                <w:sz w:val="21"/>
+              </w:rPr>
+              <w:t>④ Min(RTDRank)</w:t>
             </w:r>
           </w:p>
           <w:p>
             <w:pPr>
               <w:keepNext/>
-              <w:spacing w:before="60" w:after="40" w:line="360" w:lineRule="auto"/>
+              <w:spacing w:before="40" w:after="20" w:line="312" w:lineRule="auto"/>
               <w:jc w:val="left"/>
             </w:pPr>
             <w:r>
@@ -1703,13 +1808,13 @@
                 <w:color w:val="000000"/>
                 <w:sz w:val="21"/>
               </w:rPr>
-              <w:t>1.4.4 Context循环挑选Pilot</w:t>
+              <w:t>1.4.3 Context 循环挑选 Pilot</w:t>
             </w:r>
           </w:p>
           <w:p>
             <w:pPr>
               <w:keepNext w:val="0"/>
-              <w:spacing w:before="0" w:after="40" w:line="360" w:lineRule="auto"/>
+              <w:spacing w:before="0" w:after="40" w:line="312" w:lineRule="auto"/>
               <w:ind w:firstLine="420"/>
               <w:jc w:val="both"/>
             </w:pPr>
@@ -1721,7 +1826,7 @@
                 <w:color w:val="000000"/>
                 <w:sz w:val="21"/>
               </w:rPr>
-              <w:t>将排序第一的 Lot+Context 固定为已选 Pilot Context，并剔除与已选 Context 相同的其他 Lot+Context；更新 ReticleSTNRank、ContextCandidateCount、ActualSTNPilotCount 后进入下一轮，直至无可用 Context 或无可用 Lot。每个 Context 最多选择一个 Pilot。</w:t>
+              <w:t>将排序第一的 Lot+Context 固定，作为已选 Pilot 的 Context，并去除 lot/Context 与已选 Context 相同的其他 Lot+Context，在更新 ReticleSTNRank、ContextCandidateCount、ActualSTNPilotCount 指标后，进入下一轮循环，直至无可用 Context 或无可用 Lot 后，结束循环。每个 Context 最多选择一个 Pilot。</w:t>
             </w:r>
           </w:p>
           <w:tbl>
@@ -1771,7 +1876,7 @@
                       <w:color w:val="000000"/>
                       <w:sz w:val="21"/>
                     </w:rPr>
-                    <w:t>图1　RTD候选筛选与Pilot选择流程</w:t>
+                    <w:t>图1  RTD候选筛选与Pilot选择流程</w:t>
                   </w:r>
                 </w:p>
                 <w:p>
@@ -1821,7 +1926,7 @@
           <w:p>
             <w:pPr>
               <w:keepNext/>
-              <w:spacing w:before="80" w:after="40" w:line="360" w:lineRule="auto"/>
+              <w:spacing w:before="60" w:after="20" w:line="312" w:lineRule="auto"/>
               <w:jc w:val="left"/>
             </w:pPr>
             <w:r>
@@ -1838,7 +1943,7 @@
           <w:p>
             <w:pPr>
               <w:keepNext w:val="0"/>
-              <w:spacing w:before="0" w:after="40" w:line="360" w:lineRule="auto"/>
+              <w:spacing w:before="0" w:after="40" w:line="312" w:lineRule="auto"/>
               <w:ind w:firstLine="420"/>
               <w:jc w:val="both"/>
             </w:pPr>
@@ -1850,13 +1955,13 @@
                 <w:color w:val="000000"/>
                 <w:sz w:val="21"/>
               </w:rPr>
-              <w:t>判断 Lot 是否需要整批设为 Pilot；不满足整批条件时，按规则选片进行物理分批。</w:t>
+              <w:t>判断 Lot 是否要整批设为 Pilot，不满足的需要选片进行物理分批。</w:t>
             </w:r>
           </w:p>
           <w:p>
             <w:pPr>
               <w:keepNext/>
-              <w:spacing w:before="60" w:after="40" w:line="360" w:lineRule="auto"/>
+              <w:spacing w:before="40" w:after="20" w:line="312" w:lineRule="auto"/>
               <w:jc w:val="left"/>
             </w:pPr>
             <w:r>
@@ -1867,13 +1972,103 @@
                 <w:color w:val="000000"/>
                 <w:sz w:val="21"/>
               </w:rPr>
-              <w:t>1.5.1 整批设为Pilot场景</w:t>
+              <w:t>1.5.1 整批设为 Pilot 场景</w:t>
             </w:r>
           </w:p>
           <w:p>
             <w:pPr>
               <w:keepNext w:val="0"/>
-              <w:spacing w:before="0" w:after="40" w:line="360" w:lineRule="auto"/>
+              <w:spacing w:before="0" w:after="20" w:line="312" w:lineRule="auto"/>
+              <w:ind w:left="420"/>
+              <w:jc w:val="both"/>
+            </w:pPr>
+            <w:r>
+              <w:rPr>
+                <w:rFonts w:ascii="Times New Roman" w:hAnsi="Times New Roman" w:eastAsia="SimSun" w:cs="Times New Roman"/>
+                <w:b w:val="0"/>
+                <w:i w:val="0"/>
+                <w:color w:val="000000"/>
+                <w:sz w:val="21"/>
+              </w:rPr>
+              <w:t>（1）Lot 生效 BulletLot=1 或 KeyLot=1；</w:t>
+            </w:r>
+          </w:p>
+          <w:p>
+            <w:pPr>
+              <w:keepNext w:val="0"/>
+              <w:spacing w:before="0" w:after="20" w:line="312" w:lineRule="auto"/>
+              <w:ind w:left="420"/>
+              <w:jc w:val="both"/>
+            </w:pPr>
+            <w:r>
+              <w:rPr>
+                <w:rFonts w:ascii="Times New Roman" w:hAnsi="Times New Roman" w:eastAsia="SimSun" w:cs="Times New Roman"/>
+                <w:b w:val="0"/>
+                <w:i w:val="0"/>
+                <w:color w:val="000000"/>
+                <w:sz w:val="21"/>
+              </w:rPr>
+              <w:t>（2）Lot 的 CurCapability=LithoCapability 且 FuLL(RemainQ)；</w:t>
+            </w:r>
+          </w:p>
+          <w:p>
+            <w:pPr>
+              <w:keepNext w:val="0"/>
+              <w:spacing w:before="0" w:after="20" w:line="312" w:lineRule="auto"/>
+              <w:ind w:left="420"/>
+              <w:jc w:val="both"/>
+            </w:pPr>
+            <w:r>
+              <w:rPr>
+                <w:rFonts w:ascii="Times New Roman" w:hAnsi="Times New Roman" w:eastAsia="SimSun" w:cs="Times New Roman"/>
+                <w:b w:val="0"/>
+                <w:i w:val="0"/>
+                <w:color w:val="000000"/>
+                <w:sz w:val="21"/>
+              </w:rPr>
+              <w:t>（3）Lot 的指标 RequiredChuckCount=0；</w:t>
+            </w:r>
+          </w:p>
+          <w:p>
+            <w:pPr>
+              <w:keepNext w:val="0"/>
+              <w:spacing w:before="0" w:after="20" w:line="312" w:lineRule="auto"/>
+              <w:ind w:left="420"/>
+              <w:jc w:val="both"/>
+            </w:pPr>
+            <w:r>
+              <w:rPr>
+                <w:rFonts w:ascii="Times New Roman" w:hAnsi="Times New Roman" w:eastAsia="SimSun" w:cs="Times New Roman"/>
+                <w:b w:val="0"/>
+                <w:i w:val="0"/>
+                <w:color w:val="000000"/>
+                <w:sz w:val="21"/>
+              </w:rPr>
+              <w:t>（4）Lot 的指标 SplitCntMatched=0；</w:t>
+            </w:r>
+          </w:p>
+          <w:p>
+            <w:pPr>
+              <w:keepNext w:val="0"/>
+              <w:spacing w:before="0" w:after="20" w:line="312" w:lineRule="auto"/>
+              <w:ind w:left="420"/>
+              <w:jc w:val="both"/>
+            </w:pPr>
+            <w:r>
+              <w:rPr>
+                <w:rFonts w:ascii="Times New Roman" w:hAnsi="Times New Roman" w:eastAsia="SimSun" w:cs="Times New Roman"/>
+                <w:b w:val="0"/>
+                <w:i w:val="0"/>
+                <w:color w:val="000000"/>
+                <w:sz w:val="21"/>
+              </w:rPr>
+              <w:t>（5）Lot 的片数 componentqty&lt;=6</w:t>
+            </w:r>
+          </w:p>
+          <w:p>
+            <w:pPr>
+              <w:keepNext w:val="0"/>
+              <w:spacing w:before="0" w:after="40" w:line="312" w:lineRule="auto"/>
               <w:ind w:firstLine="420"/>
               <w:jc w:val="both"/>
             </w:pPr>
@@ -1885,121 +2080,13 @@
                 <w:color w:val="000000"/>
                 <w:sz w:val="21"/>
               </w:rPr>
-              <w:t>以下五项为“或”关系，任一项成立时设置 IsNeedSplit=F，并将整批 Lot 设为 Pilot：</w:t>
-            </w:r>
-          </w:p>
-          <w:p>
-            <w:pPr>
-              <w:keepNext w:val="0"/>
-              <w:spacing w:before="0" w:after="20" w:line="360" w:lineRule="auto"/>
-              <w:ind w:left="420"/>
-              <w:jc w:val="both"/>
-            </w:pPr>
-            <w:r>
-              <w:rPr>
-                <w:rFonts w:ascii="Times New Roman" w:hAnsi="Times New Roman" w:eastAsia="SimSun" w:cs="Times New Roman"/>
-                <w:b w:val="0"/>
-                <w:i w:val="0"/>
-                <w:color w:val="000000"/>
-                <w:sz w:val="21"/>
-              </w:rPr>
-              <w:t>（1）BulletLot=1 或 KeyLot=1；</w:t>
-            </w:r>
-          </w:p>
-          <w:p>
-            <w:pPr>
-              <w:keepNext w:val="0"/>
-              <w:spacing w:before="0" w:after="20" w:line="360" w:lineRule="auto"/>
-              <w:ind w:left="420"/>
-              <w:jc w:val="both"/>
-            </w:pPr>
-            <w:r>
-              <w:rPr>
-                <w:rFonts w:ascii="Times New Roman" w:hAnsi="Times New Roman" w:eastAsia="SimSun" w:cs="Times New Roman"/>
-                <w:b w:val="0"/>
-                <w:i w:val="0"/>
-                <w:color w:val="000000"/>
-                <w:sz w:val="21"/>
-              </w:rPr>
-              <w:t>（2）CurCapability=LithoCapability 且 FuLL(RemainQ)；</w:t>
-            </w:r>
-          </w:p>
-          <w:p>
-            <w:pPr>
-              <w:keepNext w:val="0"/>
-              <w:spacing w:before="0" w:after="20" w:line="360" w:lineRule="auto"/>
-              <w:ind w:left="420"/>
-              <w:jc w:val="both"/>
-            </w:pPr>
-            <w:r>
-              <w:rPr>
-                <w:rFonts w:ascii="Times New Roman" w:hAnsi="Times New Roman" w:eastAsia="SimSun" w:cs="Times New Roman"/>
-                <w:b w:val="0"/>
-                <w:i w:val="0"/>
-                <w:color w:val="000000"/>
-                <w:sz w:val="21"/>
-              </w:rPr>
-              <w:t>（3）RequiredChuckCount=0；</w:t>
-            </w:r>
-          </w:p>
-          <w:p>
-            <w:pPr>
-              <w:keepNext w:val="0"/>
-              <w:spacing w:before="0" w:after="20" w:line="360" w:lineRule="auto"/>
-              <w:ind w:left="420"/>
-              <w:jc w:val="both"/>
-            </w:pPr>
-            <w:r>
-              <w:rPr>
-                <w:rFonts w:ascii="Times New Roman" w:hAnsi="Times New Roman" w:eastAsia="SimSun" w:cs="Times New Roman"/>
-                <w:b w:val="0"/>
-                <w:i w:val="0"/>
-                <w:color w:val="000000"/>
-                <w:sz w:val="21"/>
-              </w:rPr>
-              <w:t>（4）SplitCntMatched=0；</w:t>
-            </w:r>
-          </w:p>
-          <w:p>
-            <w:pPr>
-              <w:keepNext w:val="0"/>
-              <w:spacing w:before="0" w:after="20" w:line="360" w:lineRule="auto"/>
-              <w:ind w:left="420"/>
-              <w:jc w:val="both"/>
-            </w:pPr>
-            <w:r>
-              <w:rPr>
-                <w:rFonts w:ascii="Times New Roman" w:hAnsi="Times New Roman" w:eastAsia="SimSun" w:cs="Times New Roman"/>
-                <w:b w:val="0"/>
-                <w:i w:val="0"/>
-                <w:color w:val="000000"/>
-                <w:sz w:val="21"/>
-              </w:rPr>
-              <w:t>（5）componentqty≤6。</w:t>
-            </w:r>
-          </w:p>
-          <w:p>
-            <w:pPr>
-              <w:keepNext w:val="0"/>
-              <w:spacing w:before="0" w:after="40" w:line="360" w:lineRule="auto"/>
-              <w:ind w:firstLine="420"/>
-              <w:jc w:val="both"/>
-            </w:pPr>
-            <w:r>
-              <w:rPr>
-                <w:rFonts w:ascii="Times New Roman" w:hAnsi="Times New Roman" w:eastAsia="SimSun" w:cs="Times New Roman"/>
-                <w:b w:val="0"/>
-                <w:i w:val="0"/>
-                <w:color w:val="000000"/>
-                <w:sz w:val="21"/>
-              </w:rPr>
-              <w:t>componentqty&gt;0 由上游系统保证，本需求不增加零片判断。</w:t>
+              <w:t>以上五项为“或”关系，任一项成立时将整批设为 Pilot。</w:t>
             </w:r>
           </w:p>
           <w:p>
             <w:pPr>
               <w:keepNext/>
-              <w:spacing w:before="60" w:after="40" w:line="360" w:lineRule="auto"/>
+              <w:spacing w:before="40" w:after="20" w:line="312" w:lineRule="auto"/>
               <w:jc w:val="left"/>
             </w:pPr>
             <w:r>
@@ -2016,7 +2103,7 @@
           <w:p>
             <w:pPr>
               <w:keepNext w:val="0"/>
-              <w:spacing w:before="0" w:after="40" w:line="360" w:lineRule="auto"/>
+              <w:spacing w:before="0" w:after="40" w:line="312" w:lineRule="auto"/>
               <w:ind w:firstLine="420"/>
               <w:jc w:val="both"/>
             </w:pPr>
@@ -2028,13 +2115,13 @@
                 <w:color w:val="000000"/>
                 <w:sz w:val="21"/>
               </w:rPr>
-              <w:t>不满足 1.5.1 任一条件时，设置 IsNeedSplit=T，并执行物理分批选片。</w:t>
+              <w:t>不满足 1.5.1 场景时，Pilot 需要物理分批，Flag:IsNeedSplit 生效 T，并进行选片，规则如下：</w:t>
             </w:r>
           </w:p>
           <w:p>
             <w:pPr>
               <w:keepNext/>
-              <w:spacing w:before="40" w:after="40" w:line="360" w:lineRule="auto"/>
+              <w:spacing w:before="20" w:after="20" w:line="312" w:lineRule="auto"/>
               <w:jc w:val="left"/>
             </w:pPr>
             <w:r>
@@ -2045,13 +2132,31 @@
                 <w:color w:val="000000"/>
                 <w:sz w:val="21"/>
               </w:rPr>
-              <w:t>1.5.2.1 Wafer分组</w:t>
+              <w:t>1.5.2.1 Wafer 分组</w:t>
             </w:r>
           </w:p>
           <w:p>
             <w:pPr>
               <w:keepNext w:val="0"/>
-              <w:spacing w:before="0" w:after="20" w:line="360" w:lineRule="auto"/>
+              <w:spacing w:before="0" w:after="40" w:line="312" w:lineRule="auto"/>
+              <w:ind w:firstLine="420"/>
+              <w:jc w:val="both"/>
+            </w:pPr>
+            <w:r>
+              <w:rPr>
+                <w:rFonts w:ascii="Times New Roman" w:hAnsi="Times New Roman" w:eastAsia="SimSun" w:cs="Times New Roman"/>
+                <w:b w:val="0"/>
+                <w:i w:val="0"/>
+                <w:color w:val="000000"/>
+                <w:sz w:val="21"/>
+              </w:rPr>
+              <w:t>将 Lot 的 Wafer 分为以下层级：</w:t>
+            </w:r>
+          </w:p>
+          <w:p>
+            <w:pPr>
+              <w:keepNext w:val="0"/>
+              <w:spacing w:before="0" w:after="20" w:line="312" w:lineRule="auto"/>
               <w:ind w:left="420"/>
               <w:jc w:val="both"/>
             </w:pPr>
@@ -2063,13 +2168,13 @@
                 <w:color w:val="000000"/>
                 <w:sz w:val="21"/>
               </w:rPr>
-              <w:t>（1）Group层：Wafer ID 1～10 划入 Group1，Wafer ID 11～25 划入 Group2。</w:t>
+              <w:t>（1）Group 层：按 Waferid 编号，Waferid #1-#10 的 Wafer 划入 Group1；Waferid #11-#25 的 Wafer 划入 Group2。</w:t>
             </w:r>
           </w:p>
           <w:p>
             <w:pPr>
               <w:keepNext w:val="0"/>
-              <w:spacing w:before="0" w:after="20" w:line="360" w:lineRule="auto"/>
+              <w:spacing w:before="0" w:after="20" w:line="312" w:lineRule="auto"/>
               <w:ind w:left="420"/>
               <w:jc w:val="both"/>
             </w:pPr>
@@ -2081,13 +2186,13 @@
                 <w:color w:val="000000"/>
                 <w:sz w:val="21"/>
               </w:rPr>
-              <w:t>（2）SubGroup层：有 Chuck 信息时，C1 划入 SubGroup1，C2 划入 SubGroup2；无 Chuck 信息时，奇数 Slot 划入 SubGroup1，偶数 Slot 划入 SubGroup2。</w:t>
+              <w:t>（2）SubGroup 层：若 Lot 有 Chuck 信息，则 Chuck1（C1）的 Wafer → SubGroup1，Chuck2（C2）的 Wafer → SubGroup2；否则按 SlotMap，奇数 Slot 的 Wafer → SubGroup1，偶数 Slot 的 Wafer → SubGroup2。</w:t>
             </w:r>
           </w:p>
           <w:p>
             <w:pPr>
               <w:keepNext w:val="0"/>
-              <w:spacing w:before="0" w:after="20" w:line="360" w:lineRule="auto"/>
+              <w:spacing w:before="0" w:after="20" w:line="312" w:lineRule="auto"/>
               <w:ind w:left="420"/>
               <w:jc w:val="both"/>
             </w:pPr>
@@ -2099,13 +2204,13 @@
                 <w:color w:val="000000"/>
                 <w:sz w:val="21"/>
               </w:rPr>
-              <w:t>（3）GroupRank：Group1+SubGroup1=1；Group1+SubGroup2=2；Group2+SubGroup1=3；Group2+SubGroup2=4。</w:t>
+              <w:t>（3）GroupRank 赋值：Group1-SubGroup1 =1；Group1-SubGroup2 =2；Group2-SubGroup1 =3；Group2-SubGroup2 =4。</w:t>
             </w:r>
           </w:p>
           <w:p>
             <w:pPr>
               <w:keepNext/>
-              <w:spacing w:before="40" w:after="40" w:line="360" w:lineRule="auto"/>
+              <w:spacing w:before="20" w:after="20" w:line="312" w:lineRule="auto"/>
               <w:jc w:val="left"/>
             </w:pPr>
             <w:r>
@@ -2116,13 +2221,13 @@
                 <w:color w:val="000000"/>
                 <w:sz w:val="21"/>
               </w:rPr>
-              <w:t>1.5.2.2 Wafer排序与选择</w:t>
+              <w:t>1.5.2.2 Wafer 排序与选择</w:t>
             </w:r>
           </w:p>
           <w:p>
             <w:pPr>
               <w:keepNext w:val="0"/>
-              <w:spacing w:before="0" w:after="40" w:line="360" w:lineRule="auto"/>
+              <w:spacing w:before="0" w:after="40" w:line="312" w:lineRule="auto"/>
               <w:ind w:firstLine="420"/>
               <w:jc w:val="both"/>
             </w:pPr>
@@ -2134,13 +2239,13 @@
                 <w:color w:val="000000"/>
                 <w:sz w:val="21"/>
               </w:rPr>
-              <w:t>在 Group+SubGroup 内按 Wafer ID 升序编号为 WaferRank，最终按 WaferRank ASC、GroupRank ASC 轮流选片。</w:t>
+              <w:t>在 Group + SubGroup 内按 waferid 排序并编号，记为 WaferRank。按以下优先级排序：① MIN(WaferRank)；② MIN(GroupRank)。</w:t>
             </w:r>
           </w:p>
           <w:p>
             <w:pPr>
               <w:keepNext w:val="0"/>
-              <w:spacing w:before="0" w:after="40" w:line="360" w:lineRule="auto"/>
+              <w:spacing w:before="0" w:after="40" w:line="312" w:lineRule="auto"/>
               <w:ind w:firstLine="420"/>
               <w:jc w:val="both"/>
             </w:pPr>
@@ -2152,30 +2257,13 @@
                 <w:color w:val="000000"/>
                 <w:sz w:val="21"/>
               </w:rPr>
-              <w:t>pi_splitcnt 为空、等于 0、小于 0 或大于 25 时，使用默认值 4；有效范围为 1～25。若选片数大于 Lot 当前可用 Wafer 数，则不执行物理分批，改为整批 Pilot。选中的 Wafer 记为 pi_splitwafer，物理分批后的子批设置为 Pilot。</w:t>
-            </w:r>
-          </w:p>
-          <w:p>
-            <w:pPr>
-              <w:keepNext/>
-              <w:spacing w:before="60" w:after="40" w:line="360" w:lineRule="auto"/>
-              <w:jc w:val="left"/>
-            </w:pPr>
-            <w:r>
-              <w:rPr>
-                <w:rFonts w:ascii="Times New Roman" w:hAnsi="Times New Roman" w:eastAsia="SimSun" w:cs="Times New Roman"/>
-                <w:b/>
-                <w:i w:val="0"/>
-                <w:color w:val="000000"/>
-                <w:sz w:val="21"/>
-              </w:rPr>
-              <w:t>1.5.3 Merge站点设定</w:t>
+              <w:t>选择规则：</w:t>
             </w:r>
           </w:p>
           <w:p>
             <w:pPr>
               <w:keepNext w:val="0"/>
-              <w:spacing w:before="0" w:after="40" w:line="360" w:lineRule="auto"/>
+              <w:spacing w:before="0" w:after="40" w:line="312" w:lineRule="auto"/>
               <w:ind w:firstLine="420"/>
               <w:jc w:val="both"/>
             </w:pPr>
@@ -2187,7 +2275,60 @@
                 <w:color w:val="000000"/>
                 <w:sz w:val="21"/>
               </w:rPr>
-              <w:t>若 Lot 存在不包含 SRC 的 ADI 站点，则将第一道符合条件的 ADI 设置为 Merge 站点；否则将最后一道 CD 设置为 Merge 站点。有效 Merge 站点由现有流程保证。</w:t>
+              <w:t>若 Context 对应的 pi_splitcnt 有值，则按排序顺序挑选 pi_splitcnt 片 Wafer 作为 pi_splitwafer；pi_splitcnt 为空、为0、为负数或大于25时，使用默认值4。若选片数大于 Lot 当前可用 Wafer 数，则不执行物理分批，改为整批 Pilot。</w:t>
+            </w:r>
+          </w:p>
+          <w:p>
+            <w:pPr>
+              <w:keepNext w:val="0"/>
+              <w:spacing w:before="0" w:after="40" w:line="312" w:lineRule="auto"/>
+              <w:ind w:firstLine="420"/>
+              <w:jc w:val="both"/>
+            </w:pPr>
+            <w:r>
+              <w:rPr>
+                <w:rFonts w:ascii="Times New Roman" w:hAnsi="Times New Roman" w:eastAsia="SimSun" w:cs="Times New Roman"/>
+                <w:b w:val="0"/>
+                <w:i w:val="0"/>
+                <w:color w:val="000000"/>
+                <w:sz w:val="21"/>
+              </w:rPr>
+              <w:t>将 pi_splitwafer 分批后设为 Pilot。</w:t>
+            </w:r>
+          </w:p>
+          <w:p>
+            <w:pPr>
+              <w:keepNext/>
+              <w:spacing w:before="40" w:after="20" w:line="312" w:lineRule="auto"/>
+              <w:jc w:val="left"/>
+            </w:pPr>
+            <w:r>
+              <w:rPr>
+                <w:rFonts w:ascii="Times New Roman" w:hAnsi="Times New Roman" w:eastAsia="SimSun" w:cs="Times New Roman"/>
+                <w:b/>
+                <w:i w:val="0"/>
+                <w:color w:val="000000"/>
+                <w:sz w:val="21"/>
+              </w:rPr>
+              <w:t>1.5.3 Merge 站点设定</w:t>
+            </w:r>
+          </w:p>
+          <w:p>
+            <w:pPr>
+              <w:keepNext w:val="0"/>
+              <w:spacing w:before="0" w:after="40" w:line="312" w:lineRule="auto"/>
+              <w:ind w:firstLine="420"/>
+              <w:jc w:val="both"/>
+            </w:pPr>
+            <w:r>
+              <w:rPr>
+                <w:rFonts w:ascii="Times New Roman" w:hAnsi="Times New Roman" w:eastAsia="SimSun" w:cs="Times New Roman"/>
+                <w:b w:val="0"/>
+                <w:i w:val="0"/>
+                <w:color w:val="000000"/>
+                <w:sz w:val="21"/>
+              </w:rPr>
+              <w:t>若 Lot 有 ADI 站点（不包含 SRC），则 lot 需物理分批时，将第一道 ADI 设为 Merge 站点；否则将最后一道 CD 设为 Merge 站点。</w:t>
             </w:r>
           </w:p>
           <w:tbl>
@@ -2237,7 +2378,7 @@
                       <w:color w:val="000000"/>
                       <w:sz w:val="21"/>
                     </w:rPr>
-                    <w:t>图2　Pilot整批与物理分批判断流程</w:t>
+                    <w:t>图2  Pilot整批与物理分批判断流程</w:t>
                   </w:r>
                 </w:p>
                 <w:p>
@@ -2287,7 +2428,7 @@
           <w:p>
             <w:pPr>
               <w:keepNext/>
-              <w:spacing w:before="80" w:after="40" w:line="360" w:lineRule="auto"/>
+              <w:spacing w:before="60" w:after="20" w:line="312" w:lineRule="auto"/>
               <w:jc w:val="left"/>
             </w:pPr>
             <w:r>
@@ -2298,13 +2439,13 @@
                 <w:color w:val="000000"/>
                 <w:sz w:val="21"/>
               </w:rPr>
-              <w:t>1.6 输出Report</w:t>
+              <w:t>1.6 输出 Report</w:t>
             </w:r>
           </w:p>
           <w:p>
             <w:pPr>
               <w:keepNext w:val="0"/>
-              <w:spacing w:before="0" w:after="40" w:line="360" w:lineRule="auto"/>
+              <w:spacing w:before="0" w:after="40" w:line="312" w:lineRule="auto"/>
               <w:ind w:firstLine="420"/>
               <w:jc w:val="both"/>
             </w:pPr>
@@ -2316,13 +2457,13 @@
                 <w:color w:val="000000"/>
                 <w:sz w:val="21"/>
               </w:rPr>
-              <w:t>将计算结果存入 Report：Central_GetLithoR2RAutoPirunInfo，供 AMA 读取执行。</w:t>
+              <w:t>以上全部计算结果存入 Report：Central_GetLithoR2RAutoPirunInfo，供 AMA 读取执行。</w:t>
             </w:r>
           </w:p>
           <w:p>
             <w:pPr>
               <w:keepNext w:val="0"/>
-              <w:spacing w:before="0" w:after="40" w:line="360" w:lineRule="auto"/>
+              <w:spacing w:before="0" w:after="40" w:line="312" w:lineRule="auto"/>
               <w:ind w:firstLine="420"/>
               <w:jc w:val="both"/>
             </w:pPr>
@@ -2339,26 +2480,8 @@
           </w:p>
           <w:p>
             <w:pPr>
-              <w:keepNext w:val="0"/>
-              <w:spacing w:before="0" w:after="40" w:line="360" w:lineRule="auto"/>
-              <w:ind w:firstLine="420"/>
-              <w:jc w:val="both"/>
-            </w:pPr>
-            <w:r>
-              <w:rPr>
-                <w:rFonts w:ascii="Times New Roman" w:hAnsi="Times New Roman" w:eastAsia="SimSun" w:cs="Times New Roman"/>
-                <w:b w:val="0"/>
-                <w:i w:val="0"/>
-                <w:color w:val="000000"/>
-                <w:sz w:val="21"/>
-              </w:rPr>
-              <w:t>保持现有 Report 输出范围和记录方式，不新增 request_id、generated_time、execution_status、error_code。</w:t>
-            </w:r>
-          </w:p>
-          <w:p>
-            <w:pPr>
               <w:keepNext/>
-              <w:spacing w:before="100" w:after="40" w:line="360" w:lineRule="auto"/>
+              <w:spacing w:before="60" w:after="20" w:line="312" w:lineRule="auto"/>
               <w:jc w:val="left"/>
             </w:pPr>
             <w:r>
@@ -2375,7 +2498,7 @@
           <w:p>
             <w:pPr>
               <w:keepNext w:val="0"/>
-              <w:spacing w:before="0" w:after="40" w:line="360" w:lineRule="auto"/>
+              <w:spacing w:before="0" w:after="40" w:line="312" w:lineRule="auto"/>
               <w:ind w:firstLine="420"/>
               <w:jc w:val="both"/>
             </w:pPr>
@@ -2393,7 +2516,7 @@
           <w:p>
             <w:pPr>
               <w:keepNext/>
-              <w:spacing w:before="80" w:after="40" w:line="360" w:lineRule="auto"/>
+              <w:spacing w:before="60" w:after="20" w:line="312" w:lineRule="auto"/>
               <w:jc w:val="left"/>
             </w:pPr>
             <w:r>
@@ -2404,13 +2527,13 @@
                 <w:color w:val="000000"/>
                 <w:sz w:val="21"/>
               </w:rPr>
-              <w:t>2.1 Litho Pilot拿取</w:t>
+              <w:t>2.1  Litho Pilot拿取</w:t>
             </w:r>
           </w:p>
           <w:p>
             <w:pPr>
               <w:keepNext w:val="0"/>
-              <w:spacing w:before="0" w:after="40" w:line="360" w:lineRule="auto"/>
+              <w:spacing w:before="0" w:after="40" w:line="312" w:lineRule="auto"/>
               <w:ind w:firstLine="420"/>
               <w:jc w:val="both"/>
             </w:pPr>
@@ -2428,7 +2551,7 @@
           <w:p>
             <w:pPr>
               <w:keepNext/>
-              <w:spacing w:before="60" w:after="40" w:line="360" w:lineRule="auto"/>
+              <w:spacing w:before="40" w:after="20" w:line="312" w:lineRule="auto"/>
               <w:jc w:val="left"/>
             </w:pPr>
             <w:r>
@@ -2439,13 +2562,13 @@
                 <w:color w:val="000000"/>
                 <w:sz w:val="21"/>
               </w:rPr>
-              <w:t>2.1.1 数据获取</w:t>
+              <w:t>2.1.1 数据获取：</w:t>
             </w:r>
           </w:p>
           <w:p>
             <w:pPr>
               <w:keepNext w:val="0"/>
-              <w:spacing w:before="0" w:after="40" w:line="360" w:lineRule="auto"/>
+              <w:spacing w:before="0" w:after="40" w:line="312" w:lineRule="auto"/>
               <w:ind w:firstLine="420"/>
               <w:jc w:val="both"/>
             </w:pPr>
@@ -2457,13 +2580,13 @@
                 <w:color w:val="000000"/>
                 <w:sz w:val="21"/>
               </w:rPr>
-              <w:t>从 r2r_litho_context_ovl 获取 ovl_status、pilot；从 r2r_litho_context_cd 获取 cd_status、pilot；从 fwlot 获取 appid、lottype、priority；从 fabcategorymap 获取 lottype、category。</w:t>
+              <w:t>从 r2r_litho_context_ovl 获取 ovl_status、pilot 栏位信息；从 r2r_litho_context_cd 获取 cd_status、pilot 栏位信息；从 fwlot 中获取 appid、lottype、priority 栏位信息；从 fabcategorymap 中获取 lottype、category 栏位信息。</w:t>
             </w:r>
           </w:p>
           <w:p>
             <w:pPr>
               <w:keepNext/>
-              <w:spacing w:before="60" w:after="40" w:line="360" w:lineRule="auto"/>
+              <w:spacing w:before="40" w:after="20" w:line="312" w:lineRule="auto"/>
               <w:jc w:val="left"/>
             </w:pPr>
             <w:r>
@@ -2474,13 +2597,13 @@
                 <w:color w:val="000000"/>
                 <w:sz w:val="21"/>
               </w:rPr>
-              <w:t>2.1.2 筛选判断</w:t>
+              <w:t>2.1.2 筛选判断：</w:t>
             </w:r>
           </w:p>
           <w:p>
             <w:pPr>
               <w:keepNext w:val="0"/>
-              <w:spacing w:before="0" w:after="40" w:line="360" w:lineRule="auto"/>
+              <w:spacing w:before="0" w:after="40" w:line="312" w:lineRule="auto"/>
               <w:ind w:firstLine="420"/>
               <w:jc w:val="both"/>
             </w:pPr>
@@ -2492,13 +2615,13 @@
                 <w:color w:val="000000"/>
                 <w:sz w:val="21"/>
               </w:rPr>
-              <w:t>筛选 priority&lt;5、category='Production'，且 ovl_status='PIRUNON' 或 cd_status='PIRUNON' 的 Pilot，作为需要 TransferFoup 的 Litho Pilot。</w:t>
+              <w:t>筛选出满足 priority&lt;5 且 category='Production' 且（ovl_status='PIRUNON' 或 cd_status='PIRUNON'）的 Pilot，即为需要 TransferFoup 的 Litho Pilot。</w:t>
             </w:r>
           </w:p>
           <w:p>
             <w:pPr>
               <w:keepNext/>
-              <w:spacing w:before="80" w:after="40" w:line="360" w:lineRule="auto"/>
+              <w:spacing w:before="60" w:after="20" w:line="312" w:lineRule="auto"/>
               <w:jc w:val="left"/>
             </w:pPr>
             <w:r>
@@ -2515,7 +2638,7 @@
           <w:p>
             <w:pPr>
               <w:keepNext w:val="0"/>
-              <w:spacing w:before="0" w:after="40" w:line="360" w:lineRule="auto"/>
+              <w:spacing w:before="0" w:after="40" w:line="312" w:lineRule="auto"/>
               <w:ind w:firstLine="420"/>
               <w:jc w:val="both"/>
             </w:pPr>
@@ -2527,13 +2650,31 @@
                 <w:color w:val="000000"/>
                 <w:sz w:val="21"/>
               </w:rPr>
-              <w:t>获取 2.1 中 Litho Pilot 的 Carrier 信息，按 Carrier 从 fwlot 获取所有 Lot，并保留 extrastatus='WaitForJobPrep' 的记录。若 Litho Pilot 同 Carrier 中存在其他 Lot，则该 Pilot 需要 Change Foup。</w:t>
+              <w:t>拿取 2.1 中 LithoPilot 的 Carrier 信息，By Carrier 从 fwlot 中获取所有 Lot，保留 extrastatus='WaitForJobPrep' 的 Lot。</w:t>
+            </w:r>
+          </w:p>
+          <w:p>
+            <w:pPr>
+              <w:keepNext w:val="0"/>
+              <w:spacing w:before="0" w:after="40" w:line="312" w:lineRule="auto"/>
+              <w:ind w:firstLine="420"/>
+              <w:jc w:val="both"/>
+            </w:pPr>
+            <w:r>
+              <w:rPr>
+                <w:rFonts w:ascii="Times New Roman" w:hAnsi="Times New Roman" w:eastAsia="SimSun" w:cs="Times New Roman"/>
+                <w:b w:val="0"/>
+                <w:i w:val="0"/>
+                <w:color w:val="000000"/>
+                <w:sz w:val="21"/>
+              </w:rPr>
+              <w:t>若 LithoPilot 同 Carrier 中存在其他 Lot 时，则该 Pilot 需要 Change Foup。</w:t>
             </w:r>
           </w:p>
           <w:p>
             <w:pPr>
               <w:keepNext/>
-              <w:spacing w:before="80" w:after="40" w:line="360" w:lineRule="auto"/>
+              <w:spacing w:before="60" w:after="20" w:line="312" w:lineRule="auto"/>
               <w:jc w:val="left"/>
             </w:pPr>
             <w:r>
@@ -2550,7 +2691,7 @@
           <w:p>
             <w:pPr>
               <w:keepNext w:val="0"/>
-              <w:spacing w:before="0" w:after="40" w:line="360" w:lineRule="auto"/>
+              <w:spacing w:before="0" w:after="40" w:line="312" w:lineRule="auto"/>
               <w:ind w:firstLine="420"/>
               <w:jc w:val="both"/>
             </w:pPr>
@@ -2562,13 +2703,13 @@
                 <w:color w:val="000000"/>
                 <w:sz w:val="21"/>
               </w:rPr>
-              <w:t>对需要 TransferFOUP 的 Litho Pilot，按 RemainQ ASC、Priority ASC、componentqty DESC、lotid ASC 排序，并根据排序建立 AdhocSorterJob。</w:t>
+              <w:t>对于需 TransferFOUP 的 LithoPilot 进行排序，拿取 LithoPilot 的 RemainQ、Priority、componentqty 指标，并按照 Min(RemainQ)、Min(Priority)、Max(componentqty)、Min(lotid)排序，根据排序建立 AdhocSorterJob。</w:t>
             </w:r>
           </w:p>
           <w:p>
             <w:pPr>
               <w:keepNext/>
-              <w:spacing w:before="80" w:after="40" w:line="360" w:lineRule="auto"/>
+              <w:spacing w:before="60" w:after="20" w:line="312" w:lineRule="auto"/>
               <w:jc w:val="left"/>
             </w:pPr>
             <w:r>
@@ -2579,13 +2720,13 @@
                 <w:color w:val="000000"/>
                 <w:sz w:val="21"/>
               </w:rPr>
-              <w:t>2.4 输出Report</w:t>
+              <w:t>2.4输出Report</w:t>
             </w:r>
           </w:p>
           <w:p>
             <w:pPr>
               <w:keepNext w:val="0"/>
-              <w:spacing w:before="0" w:after="40" w:line="360" w:lineRule="auto"/>
+              <w:spacing w:before="0" w:after="40" w:line="312" w:lineRule="auto"/>
               <w:ind w:firstLine="420"/>
               <w:jc w:val="both"/>
             </w:pPr>
@@ -2597,13 +2738,13 @@
                 <w:color w:val="000000"/>
                 <w:sz w:val="21"/>
               </w:rPr>
-              <w:t>从 AMA.TriggerConfig-WatchDog_LithoPiLotAutoDoAdhocSorter 获取 Switch、Trigger Time Slot、TriggerCount/Time。当 Switch='Y' 且当前时间位于现有 Trigger Time Slot 范围内时，按 TriggerCount/Time 选择 Carrier，并将结果存入 Report：LithoPiLotAutoDoAdhocSorter。栏位包括 Carrier、Pilot、extrastatus、Status、RemainQ、Pieces、Prod、Priority。</w:t>
+              <w:t>从 AMA.TriggerConfig-WatchDog_LithoPiLotAutoDoAdhocSorter 拿取 Switch、Trigger Time Slot、TriggerCount/Time 栏位信息，当 Switch='Y' 且当前时间在 Trigger Time Slot 范围内时，将前 TriggerCount/Time 个需物理分批的 Carrier 结果存入 Report:LithoPiLotAutoDoAdhocSorter 中，栏位包括：Carrier、Pilot、extrastatus、Status、RemainQ、Pieces、Prod、Priority。</w:t>
             </w:r>
           </w:p>
           <w:p>
             <w:pPr>
               <w:keepNext/>
-              <w:spacing w:before="100" w:after="40" w:line="360" w:lineRule="auto"/>
+              <w:spacing w:before="60" w:after="20" w:line="312" w:lineRule="auto"/>
               <w:jc w:val="left"/>
             </w:pPr>
             <w:r>
@@ -2620,7 +2761,7 @@
           <w:p>
             <w:pPr>
               <w:keepNext w:val="0"/>
-              <w:spacing w:before="0" w:after="40" w:line="360" w:lineRule="auto"/>
+              <w:spacing w:before="0" w:after="40" w:line="312" w:lineRule="auto"/>
               <w:ind w:firstLine="420"/>
               <w:jc w:val="both"/>
             </w:pPr>
@@ -2632,13 +2773,13 @@
                 <w:color w:val="000000"/>
                 <w:sz w:val="21"/>
               </w:rPr>
-              <w:t>在 Global Macro 中新增需要 Transfer Foup 的 Litho Pilot 卡控；在 LithoRule 中增加子母批 Run 相同机台的卡控。</w:t>
+              <w:t>在 Global Macro 中新增对需导 Foup LithoPilot 的卡控；在 LithoRule 中增加子母批 Run 相同机台的卡控。</w:t>
             </w:r>
           </w:p>
           <w:p>
             <w:pPr>
               <w:keepNext/>
-              <w:spacing w:before="80" w:after="40" w:line="360" w:lineRule="auto"/>
+              <w:spacing w:before="60" w:after="20" w:line="312" w:lineRule="auto"/>
               <w:jc w:val="left"/>
             </w:pPr>
             <w:r>
@@ -2655,7 +2796,7 @@
           <w:p>
             <w:pPr>
               <w:keepNext w:val="0"/>
-              <w:spacing w:before="0" w:after="40" w:line="360" w:lineRule="auto"/>
+              <w:spacing w:before="0" w:after="40" w:line="312" w:lineRule="auto"/>
               <w:ind w:firstLine="420"/>
               <w:jc w:val="both"/>
             </w:pPr>
@@ -2667,13 +2808,13 @@
                 <w:color w:val="000000"/>
                 <w:sz w:val="21"/>
               </w:rPr>
-              <w:t>拿取 2.1 中的 Litho Pilot。当 WatchDog_LithoPiLotAutoDoAdhocSorter 的 Switch='Y' 且当前时间位于 Trigger Time Slot 范围内时，按以下场景处理：</w:t>
+              <w:t>拿取 2.1 中的 LithoPilot，当 WatchDog_LithoPiLotAutoDoAdhocSorter 中的 Switch='Y' 且当前时间在 Trigger Time Slot 范围内时，满足以下两种场景的 lot 需卡控 Reason：</w:t>
             </w:r>
           </w:p>
           <w:p>
             <w:pPr>
               <w:keepNext w:val="0"/>
-              <w:spacing w:before="0" w:after="20" w:line="360" w:lineRule="auto"/>
+              <w:spacing w:before="0" w:after="20" w:line="312" w:lineRule="auto"/>
               <w:ind w:left="420"/>
               <w:jc w:val="both"/>
             </w:pPr>
@@ -2685,13 +2826,13 @@
                 <w:color w:val="000000"/>
                 <w:sz w:val="21"/>
               </w:rPr>
-              <w:t>（1）若 Litho Pilot 位于 AdhocSorter 站点（adhocplanname 包含 UnscheduledSorter），则同 FOUP 中不在 AdhocSorter 站点的 Other Lot 增加 Reason=WaitPilotChangeFOUP。Other Lot 位于 Litho 站点时不解除；位于 BARCO 站点时，RemainQ&lt;4 h 或触发 Qu_0 即解除；位于其他站点时，仅触发 Qu_0 时解除。</w:t>
+              <w:t>（1）若 LithoPilot 在 AdhocSoter 站点（adhocplanname 包含 'UnScheduleSorter'），则 LithoPilot 同 Foup 不在 AdhocSoter 站点的 Other Lot 需要卡控 Reason: WaitPilotChangeFOUP。Remove 规则：当 Other Lot 在 Litho 站点时，不能 Remove；当 Other Lot 在 Barco 站点时，RemainQ&lt;4H 或触发 Qu_0 时，Remove 卡控；当 Other Lot 在非 Litho/Barco 站点时，仅触发 Qu_0 时，Remove 卡控。</w:t>
             </w:r>
           </w:p>
           <w:p>
             <w:pPr>
               <w:keepNext w:val="0"/>
-              <w:spacing w:before="0" w:after="20" w:line="360" w:lineRule="auto"/>
+              <w:spacing w:before="0" w:after="20" w:line="312" w:lineRule="auto"/>
               <w:ind w:left="420"/>
               <w:jc w:val="both"/>
             </w:pPr>
@@ -2703,7 +2844,7 @@
                 <w:color w:val="000000"/>
                 <w:sz w:val="21"/>
               </w:rPr>
-              <w:t>（2）若 Litho Pilot 不在 AdhocSorter 站点，则同 FOUP 中不在 AdhocSorter 站点的 Other Lot 增加 Reason=WaitPilotChangeFOUP。Other Lot 的解除规则同（1）；当 Litho Pilot 的 RemainQ&lt;4 h 或触发 Qu_0 时，解除相关卡控。</w:t>
+              <w:t>（2）若 LithoPilot 不在 AdhocSoter 站点，则 LithoPilot 和同 Foup 不在 AdhocSoter 站点的 Other Lot 都需要卡控 Reason: WaitPilotChangeFOUP。Remove 规则：Other Lot Follow（1），LithoPilot 的 RemainQ&lt;4H 或触发 Qu_0 时，Remove 卡控。</w:t>
             </w:r>
           </w:p>
           <w:tbl>
@@ -2753,7 +2894,7 @@
                       <w:color w:val="000000"/>
                       <w:sz w:val="21"/>
                     </w:rPr>
-                    <w:t>图3　WaitPilotChangeFOUP卡控流程</w:t>
+                    <w:t>图3  WaitPilotChangeFOUP卡控流程</w:t>
                   </w:r>
                 </w:p>
                 <w:p>
@@ -2803,7 +2944,7 @@
           <w:p>
             <w:pPr>
               <w:keepNext/>
-              <w:spacing w:before="80" w:after="40" w:line="360" w:lineRule="auto"/>
+              <w:spacing w:before="60" w:after="20" w:line="312" w:lineRule="auto"/>
               <w:jc w:val="left"/>
             </w:pPr>
             <w:r>
@@ -2814,13 +2955,13 @@
                 <w:color w:val="000000"/>
                 <w:sz w:val="21"/>
               </w:rPr>
-              <w:t>3.2 Litho Rule新增卡控逻辑</w:t>
+              <w:t>3.2 Litho Rule 新增卡控逻辑</w:t>
             </w:r>
           </w:p>
           <w:p>
             <w:pPr>
               <w:keepNext/>
-              <w:spacing w:before="60" w:after="40" w:line="360" w:lineRule="auto"/>
+              <w:spacing w:before="40" w:after="20" w:line="312" w:lineRule="auto"/>
               <w:jc w:val="left"/>
             </w:pPr>
             <w:r>
@@ -2837,7 +2978,7 @@
           <w:p>
             <w:pPr>
               <w:keepNext w:val="0"/>
-              <w:spacing w:before="0" w:after="40" w:line="360" w:lineRule="auto"/>
+              <w:spacing w:before="0" w:after="40" w:line="312" w:lineRule="auto"/>
               <w:ind w:firstLine="420"/>
               <w:jc w:val="both"/>
             </w:pPr>
@@ -2849,13 +2990,13 @@
                 <w:color w:val="000000"/>
                 <w:sz w:val="21"/>
               </w:rPr>
-              <w:t>针对非 Specify Lot，若 Pi_split_flag='Y'，R2R CD 或 OVL Status='PIRUNON'，且 Pilot 不为空，则增加 Reason=R2RAutoPirunControl；否则不增加卡控。</w:t>
+              <w:t>针对非Specify Lot，若Pi_SplitFlag='Y'且R2R CD/OVL Status=PIRUNON且Pilot不为Null，则卡控 Reason:R2RAutoPirunControl，否则不卡控。</w:t>
             </w:r>
           </w:p>
           <w:p>
             <w:pPr>
               <w:keepNext/>
-              <w:spacing w:before="60" w:after="40" w:line="360" w:lineRule="auto"/>
+              <w:spacing w:before="40" w:after="20" w:line="312" w:lineRule="auto"/>
               <w:jc w:val="left"/>
             </w:pPr>
             <w:r>
@@ -2872,7 +3013,7 @@
           <w:p>
             <w:pPr>
               <w:keepNext/>
-              <w:spacing w:before="40" w:after="40" w:line="360" w:lineRule="auto"/>
+              <w:spacing w:before="20" w:after="20" w:line="312" w:lineRule="auto"/>
               <w:jc w:val="left"/>
             </w:pPr>
             <w:r>
@@ -2883,13 +3024,13 @@
                 <w:color w:val="000000"/>
                 <w:sz w:val="21"/>
               </w:rPr>
-              <w:t>3.2.2.1 判断Lot是否有Pretool</w:t>
+              <w:t>3.2.2.1 判断lot是否有Pretool</w:t>
             </w:r>
           </w:p>
           <w:p>
             <w:pPr>
               <w:keepNext w:val="0"/>
-              <w:spacing w:before="0" w:after="40" w:line="360" w:lineRule="auto"/>
+              <w:spacing w:before="0" w:after="40" w:line="312" w:lineRule="auto"/>
               <w:ind w:firstLine="420"/>
               <w:jc w:val="both"/>
             </w:pPr>
@@ -2901,13 +3042,31 @@
                 <w:color w:val="000000"/>
                 <w:sz w:val="21"/>
               </w:rPr>
-              <w:t>从 r2r_litho_context_relation 获取 productid、curr_layer、pre_layer；从 r2r_litho_context_ovl 获取 productid、layerid、pretool。按 productid+pre_layer 获取 curr_layer，再按 productid+curr_layer 获取 pretool；仅当 pretool 不为空时继续判断。</w:t>
+              <w:t>从表r2r_litho_context_relation中获取productid、curr_layer、pre_layer栏位信息；从r2r_litho_context_ovl中获取productid、layerid、pretool栏位信息；</w:t>
+            </w:r>
+          </w:p>
+          <w:p>
+            <w:pPr>
+              <w:keepNext w:val="0"/>
+              <w:spacing w:before="0" w:after="40" w:line="312" w:lineRule="auto"/>
+              <w:ind w:firstLine="420"/>
+              <w:jc w:val="both"/>
+            </w:pPr>
+            <w:r>
+              <w:rPr>
+                <w:rFonts w:ascii="Times New Roman" w:hAnsi="Times New Roman" w:eastAsia="SimSun" w:cs="Times New Roman"/>
+                <w:b w:val="0"/>
+                <w:i w:val="0"/>
+                <w:color w:val="000000"/>
+                <w:sz w:val="21"/>
+              </w:rPr>
+              <w:t>By Prod、layer从r2r_litho_context_relation（匹配productid、pre_layer）获取curr_layer，再通过Prod、curr_layer从r2r_litho_context_ovl获取pretool，当lot存在pretool不为空时，则需要后续判断。</w:t>
             </w:r>
           </w:p>
           <w:p>
             <w:pPr>
               <w:keepNext/>
-              <w:spacing w:before="40" w:after="40" w:line="360" w:lineRule="auto"/>
+              <w:spacing w:before="20" w:after="20" w:line="312" w:lineRule="auto"/>
               <w:jc w:val="left"/>
             </w:pPr>
             <w:r>
@@ -2924,7 +3083,7 @@
           <w:p>
             <w:pPr>
               <w:keepNext w:val="0"/>
-              <w:spacing w:before="0" w:after="40" w:line="360" w:lineRule="auto"/>
+              <w:spacing w:before="0" w:after="40" w:line="312" w:lineRule="auto"/>
               <w:ind w:firstLine="420"/>
               <w:jc w:val="both"/>
             </w:pPr>
@@ -2936,13 +3095,13 @@
                 <w:color w:val="000000"/>
                 <w:sz w:val="21"/>
               </w:rPr>
-              <w:t>通过 fabfutureaction 获取与当前 Lot 存在 FutureMerge 关系的子批或母批 Lot；从 r2r_lot_history 按 lotid+productid+layerid 获取其在待判断 Lot 当前 Layer 的作业机台 toolid，并按实际作业完成时间、记录 ID 降序取最新记录。</w:t>
+              <w:t>通过表fabfutureaction拿取和lot有FutureMerge关系的子批/母批lot，从表r2r_lot_history中（匹配Lotid、productid、layerid）获取最新一笔子批/母批在待判断lot当前layer的作业机台toolid（按实际作业完成时间、记录ID降序取最新记录）。</w:t>
             </w:r>
           </w:p>
           <w:p>
             <w:pPr>
               <w:keepNext/>
-              <w:spacing w:before="40" w:after="40" w:line="360" w:lineRule="auto"/>
+              <w:spacing w:before="20" w:after="20" w:line="312" w:lineRule="auto"/>
               <w:jc w:val="left"/>
             </w:pPr>
             <w:r>
@@ -2959,7 +3118,7 @@
           <w:p>
             <w:pPr>
               <w:keepNext w:val="0"/>
-              <w:spacing w:before="0" w:after="40" w:line="360" w:lineRule="auto"/>
+              <w:spacing w:before="0" w:after="40" w:line="312" w:lineRule="auto"/>
               <w:ind w:firstLine="420"/>
               <w:jc w:val="both"/>
             </w:pPr>
@@ -2971,13 +3130,13 @@
                 <w:color w:val="000000"/>
                 <w:sz w:val="21"/>
               </w:rPr>
-              <w:t>通过 r2r_litho_whitelist 按 productid、layerid、lotid 判断 Specify Lot。针对非 Specify Lot，若待判断 Lot 的机台与子批或母批作业机台 toolid 不一致，则增加 Reason=Parent&amp;ChildLotNeedRunSameTool；否则按原逻辑判断。</w:t>
+              <w:t>通过r2r_litho_whitelist判断（匹配 productid、layerid、lotid）lot是否为Specify Lot，针对非Specify Lot，若待判断lot的机台与子批/母批作业机台toolid不一致，则卡控Reason：Parent&amp;ChildLotNeedRunSameTool，否则按原逻辑判断。</w:t>
             </w:r>
           </w:p>
           <w:p>
             <w:pPr>
               <w:keepNext/>
-              <w:spacing w:before="100" w:after="40" w:line="360" w:lineRule="auto"/>
+              <w:spacing w:before="60" w:after="20" w:line="312" w:lineRule="auto"/>
               <w:jc w:val="left"/>
             </w:pPr>
             <w:r>
@@ -2994,7 +3153,7 @@
           <w:p>
             <w:pPr>
               <w:keepNext w:val="0"/>
-              <w:spacing w:before="0" w:after="40" w:line="360" w:lineRule="auto"/>
+              <w:spacing w:before="0" w:after="40" w:line="312" w:lineRule="auto"/>
               <w:ind w:firstLine="420"/>
               <w:jc w:val="both"/>
             </w:pPr>
@@ -3012,7 +3171,7 @@
           <w:p>
             <w:pPr>
               <w:keepNext/>
-              <w:spacing w:before="80" w:after="40" w:line="360" w:lineRule="auto"/>
+              <w:spacing w:before="60" w:after="20" w:line="312" w:lineRule="auto"/>
               <w:jc w:val="left"/>
             </w:pPr>
             <w:r>
@@ -3029,7 +3188,7 @@
           <w:p>
             <w:pPr>
               <w:keepNext w:val="0"/>
-              <w:spacing w:before="0" w:after="40" w:line="360" w:lineRule="auto"/>
+              <w:spacing w:before="0" w:after="40" w:line="312" w:lineRule="auto"/>
               <w:ind w:firstLine="420"/>
               <w:jc w:val="both"/>
             </w:pPr>
@@ -3041,13 +3200,13 @@
                 <w:color w:val="000000"/>
                 <w:sz w:val="21"/>
               </w:rPr>
-              <w:t>针对非 Specify Lot，若 Pi_split_flag='Y'，R2R CD 或 OVL Status='PIRUNON'，且 Pilot 不为空，则增加 Reason=R2RAutoPirunControl；否则不增加卡控。</w:t>
+              <w:t>针对非Specify Lot，若Pi_SplitFlag='Y'且R2R CD/OVL Status=PIRUNON且Pilot不为Null，则卡控 Reason:R2RAutoPirunControl，否则不卡控。</w:t>
             </w:r>
           </w:p>
           <w:p>
             <w:pPr>
               <w:keepNext/>
-              <w:spacing w:before="80" w:after="40" w:line="360" w:lineRule="auto"/>
+              <w:spacing w:before="60" w:after="20" w:line="312" w:lineRule="auto"/>
               <w:jc w:val="left"/>
             </w:pPr>
             <w:r>
@@ -3064,7 +3223,7 @@
           <w:p>
             <w:pPr>
               <w:keepNext w:val="0"/>
-              <w:spacing w:before="0" w:after="40" w:line="360" w:lineRule="auto"/>
+              <w:spacing w:before="0" w:after="40" w:line="312" w:lineRule="auto"/>
               <w:ind w:firstLine="420"/>
               <w:jc w:val="both"/>
             </w:pPr>
@@ -3076,13 +3235,13 @@
                 <w:color w:val="000000"/>
                 <w:sz w:val="21"/>
               </w:rPr>
-              <w:t>逻辑与 LithoRule 一致，pretool 及子批、母批作业机台信息改由 Central 获取。</w:t>
+              <w:t>逻辑与 LithoRule 中一致，pretool 获取和子批/母批作业机台获取改为 Central。</w:t>
             </w:r>
           </w:p>
           <w:p>
             <w:pPr>
               <w:keepNext/>
-              <w:spacing w:before="100" w:after="40" w:line="360" w:lineRule="auto"/>
+              <w:spacing w:before="60" w:after="20" w:line="312" w:lineRule="auto"/>
               <w:jc w:val="left"/>
             </w:pPr>
             <w:r>
@@ -3093,13 +3252,13 @@
                 <w:color w:val="000000"/>
                 <w:sz w:val="21"/>
               </w:rPr>
-              <w:t>二、AMA新增逻辑</w:t>
+              <w:t>二、 AMA新增逻辑</w:t>
             </w:r>
           </w:p>
           <w:p>
             <w:pPr>
               <w:keepNext w:val="0"/>
-              <w:spacing w:before="0" w:after="40" w:line="360" w:lineRule="auto"/>
+              <w:spacing w:before="0" w:after="40" w:line="312" w:lineRule="auto"/>
               <w:ind w:firstLine="420"/>
               <w:jc w:val="both"/>
             </w:pPr>
@@ -3111,13 +3270,13 @@
                 <w:color w:val="000000"/>
                 <w:sz w:val="21"/>
               </w:rPr>
-              <w:t>根据 Report：Central_GetLithoR2RAutoPirunInfo 执行 Pilot 设置和物理分批，并将 Pilot 传给 R2R；根据 Report：LithoPiLotAutoDoAdhocSorter 执行 TransferFoup。</w:t>
+              <w:t>根据 Report:Central_GetLithoR2RAutoPirunInfo 执行物理分批，并将 Pilot 给到 R2R；根据 Report:LithoPiLotAutoDoAdhocSorter执行 TransferFoup。</w:t>
             </w:r>
           </w:p>
           <w:p>
             <w:pPr>
               <w:keepNext/>
-              <w:spacing w:before="80" w:after="40" w:line="360" w:lineRule="auto"/>
+              <w:spacing w:before="60" w:after="20" w:line="312" w:lineRule="auto"/>
               <w:jc w:val="left"/>
             </w:pPr>
             <w:r>
@@ -3134,7 +3293,7 @@
           <w:p>
             <w:pPr>
               <w:keepNext w:val="0"/>
-              <w:spacing w:before="0" w:after="40" w:line="360" w:lineRule="auto"/>
+              <w:spacing w:before="0" w:after="40" w:line="312" w:lineRule="auto"/>
               <w:ind w:firstLine="420"/>
               <w:jc w:val="both"/>
             </w:pPr>
@@ -3146,13 +3305,13 @@
                 <w:color w:val="000000"/>
                 <w:sz w:val="21"/>
               </w:rPr>
-              <w:t>获取 Report：Central_GetLithoR2RAutoPirunInfo 栏位信息：Lot、toolid、productid、layerid、reticleid、prereticle、pretool、custom_context_value、pi_splitwafer、IsNeedSplit、isSTNSite。</w:t>
+              <w:t>获取 Report:Central_GetLithoR2RAutoPirunInfo 栏位信息:Lot、toolid、productid、layerid、reticleid、prereticle、pretool、custom_context_value、pi_splitwafer、IsNeedSplit、isSTNSite。</w:t>
             </w:r>
           </w:p>
           <w:p>
             <w:pPr>
               <w:keepNext/>
-              <w:spacing w:before="60" w:after="40" w:line="360" w:lineRule="auto"/>
+              <w:spacing w:before="40" w:after="20" w:line="312" w:lineRule="auto"/>
               <w:jc w:val="left"/>
             </w:pPr>
             <w:r>
@@ -3169,7 +3328,7 @@
           <w:p>
             <w:pPr>
               <w:keepNext w:val="0"/>
-              <w:spacing w:before="0" w:after="40" w:line="360" w:lineRule="auto"/>
+              <w:spacing w:before="0" w:after="40" w:line="312" w:lineRule="auto"/>
               <w:ind w:firstLine="420"/>
               <w:jc w:val="both"/>
             </w:pPr>
@@ -3187,7 +3346,7 @@
           <w:p>
             <w:pPr>
               <w:keepNext/>
-              <w:spacing w:before="60" w:after="40" w:line="360" w:lineRule="auto"/>
+              <w:spacing w:before="40" w:after="20" w:line="312" w:lineRule="auto"/>
               <w:jc w:val="left"/>
             </w:pPr>
             <w:r>
@@ -3203,26 +3362,8 @@
           </w:p>
           <w:p>
             <w:pPr>
-              <w:keepNext w:val="0"/>
-              <w:spacing w:before="0" w:after="40" w:line="360" w:lineRule="auto"/>
-              <w:ind w:firstLine="420"/>
-              <w:jc w:val="both"/>
-            </w:pPr>
-            <w:r>
-              <w:rPr>
-                <w:rFonts w:ascii="Times New Roman" w:hAnsi="Times New Roman" w:eastAsia="SimSun" w:cs="Times New Roman"/>
-                <w:b w:val="0"/>
-                <w:i w:val="0"/>
-                <w:color w:val="000000"/>
-                <w:sz w:val="21"/>
-              </w:rPr>
-              <w:t>当 IsNeedSplit=T 时，按以下顺序处理。</w:t>
-            </w:r>
-          </w:p>
-          <w:p>
-            <w:pPr>
               <w:keepNext/>
-              <w:spacing w:before="40" w:after="40" w:line="360" w:lineRule="auto"/>
+              <w:spacing w:before="20" w:after="20" w:line="312" w:lineRule="auto"/>
               <w:jc w:val="left"/>
             </w:pPr>
             <w:r>
@@ -3239,7 +3380,7 @@
           <w:p>
             <w:pPr>
               <w:keepNext w:val="0"/>
-              <w:spacing w:before="0" w:after="20" w:line="360" w:lineRule="auto"/>
+              <w:spacing w:before="0" w:after="20" w:line="312" w:lineRule="auto"/>
               <w:ind w:left="420"/>
               <w:jc w:val="both"/>
             </w:pPr>
@@ -3251,13 +3392,13 @@
                 <w:color w:val="000000"/>
                 <w:sz w:val="21"/>
               </w:rPr>
-              <w:t>（1）分批 Lot 属于当前执行工厂，即 FAB6 或 FAB8；</w:t>
+              <w:t>（1）分批 Lot 属于本厂，即 FAB6 或 FAB8；</w:t>
             </w:r>
           </w:p>
           <w:p>
             <w:pPr>
               <w:keepNext w:val="0"/>
-              <w:spacing w:before="0" w:after="20" w:line="360" w:lineRule="auto"/>
+              <w:spacing w:before="0" w:after="20" w:line="312" w:lineRule="auto"/>
               <w:ind w:left="420"/>
               <w:jc w:val="both"/>
             </w:pPr>
@@ -3269,13 +3410,13 @@
                 <w:color w:val="000000"/>
                 <w:sz w:val="21"/>
               </w:rPr>
-              <w:t>（2）fwlot.extrastatus='WaitForJobPrep'；</w:t>
+              <w:t>（2）Lot 当前状态为 WaitForJobPrep；</w:t>
             </w:r>
           </w:p>
           <w:p>
             <w:pPr>
               <w:keepNext w:val="0"/>
-              <w:spacing w:before="0" w:after="20" w:line="360" w:lineRule="auto"/>
+              <w:spacing w:before="0" w:after="20" w:line="312" w:lineRule="auto"/>
               <w:ind w:left="420"/>
               <w:jc w:val="both"/>
             </w:pPr>
@@ -3293,7 +3434,7 @@
           <w:p>
             <w:pPr>
               <w:keepNext w:val="0"/>
-              <w:spacing w:before="0" w:after="20" w:line="360" w:lineRule="auto"/>
+              <w:spacing w:before="0" w:after="20" w:line="312" w:lineRule="auto"/>
               <w:ind w:left="420"/>
               <w:jc w:val="both"/>
             </w:pPr>
@@ -3311,7 +3452,7 @@
           <w:p>
             <w:pPr>
               <w:keepNext w:val="0"/>
-              <w:spacing w:before="0" w:after="20" w:line="360" w:lineRule="auto"/>
+              <w:spacing w:before="0" w:after="20" w:line="312" w:lineRule="auto"/>
               <w:ind w:left="420"/>
               <w:jc w:val="both"/>
             </w:pPr>
@@ -3329,7 +3470,7 @@
           <w:p>
             <w:pPr>
               <w:keepNext w:val="0"/>
-              <w:spacing w:before="0" w:after="20" w:line="360" w:lineRule="auto"/>
+              <w:spacing w:before="0" w:after="20" w:line="312" w:lineRule="auto"/>
               <w:ind w:left="420"/>
               <w:jc w:val="both"/>
             </w:pPr>
@@ -3341,13 +3482,13 @@
                 <w:color w:val="000000"/>
                 <w:sz w:val="21"/>
               </w:rPr>
-              <w:t>（6）Report 中选中的 Wafer 当前仍归属于该 Lot。</w:t>
+              <w:t>（6）Report 中选中的 Wafer 确实存在于该 Lot 中。</w:t>
             </w:r>
           </w:p>
           <w:p>
             <w:pPr>
               <w:keepNext w:val="0"/>
-              <w:spacing w:before="0" w:after="40" w:line="360" w:lineRule="auto"/>
+              <w:spacing w:before="0" w:after="40" w:line="312" w:lineRule="auto"/>
               <w:ind w:firstLine="420"/>
               <w:jc w:val="both"/>
             </w:pPr>
@@ -3359,13 +3500,13 @@
                 <w:color w:val="000000"/>
                 <w:sz w:val="21"/>
               </w:rPr>
-              <w:t>仅检查 Wafer 归属关系，不额外检查 Wafer 状态、Slot 或 Chuck。任一复核项不满足时，停止处理该 Lot，记录失败原因并等待下一轮重新计算，不回退为整批 Pilot。重复物理分批防护沿用现有系统逻辑。</w:t>
+              <w:t>仅检查 Wafer 归属关系，不额外检查 Wafer 状态、Slot 或 Chuck。任一复核项不满足时，停止处理该 Lot，记录失败原因并等待下一轮重新计算，不回退为整批 Pilot。</w:t>
             </w:r>
           </w:p>
           <w:p>
             <w:pPr>
               <w:keepNext/>
-              <w:spacing w:before="40" w:after="40" w:line="360" w:lineRule="auto"/>
+              <w:spacing w:before="20" w:after="20" w:line="312" w:lineRule="auto"/>
               <w:jc w:val="left"/>
             </w:pPr>
             <w:r>
@@ -3382,7 +3523,7 @@
           <w:p>
             <w:pPr>
               <w:keepNext w:val="0"/>
-              <w:spacing w:before="0" w:after="40" w:line="360" w:lineRule="auto"/>
+              <w:spacing w:before="0" w:after="40" w:line="312" w:lineRule="auto"/>
               <w:ind w:firstLine="420"/>
               <w:jc w:val="both"/>
             </w:pPr>
@@ -3394,25 +3535,7 @@
                 <w:color w:val="000000"/>
                 <w:sz w:val="21"/>
               </w:rPr>
-              <w:t>六项复核通过后，先获取并预占空 FOUP，再调用 MES 物理分批接口。未取得空 FOUP 时，不执行物理分批，将整批 Lot 传给 R2R。</w:t>
-            </w:r>
-          </w:p>
-          <w:p>
-            <w:pPr>
-              <w:keepNext w:val="0"/>
-              <w:spacing w:before="0" w:after="40" w:line="360" w:lineRule="auto"/>
-              <w:ind w:firstLine="420"/>
-              <w:jc w:val="both"/>
-            </w:pPr>
-            <w:r>
-              <w:rPr>
-                <w:rFonts w:ascii="Times New Roman" w:hAnsi="Times New Roman" w:eastAsia="SimSun" w:cs="Times New Roman"/>
-                <w:b w:val="0"/>
-                <w:i w:val="0"/>
-                <w:color w:val="000000"/>
-                <w:sz w:val="21"/>
-              </w:rPr>
-              <w:t>接口成功时，将 pi_splitwafer 从原 Lot 中分出，生成子批并设置为 Pilot，再按现有顺序传给 R2R、执行 Transfer FOUP。接口失败时，立即释放预占 FOUP，将整批 Lot 作为 Pilot 传给 R2R；IsNeedSplit、pi_splitwafer 的后续处理沿用现有 AMA 逻辑。</w:t>
+              <w:t>当 IsNeedSplit=T 时，先执行上述六项复核。复核通过后，先获取并预占空 Foup，再给 MES 物理分批接口，将 pi_splitwafer 从 Lot 中分出。若未拿到可用空 Foup，则不执行物理分批，将整批 Lot 传给 R2R；若分批接口 Fail，则立即释放预占的空 Foup，并将整批 Lot 传给 R2R；否则将分出的子批 pilot 传给 R2R。</w:t>
             </w:r>
           </w:p>
           <w:tbl>
@@ -3462,7 +3585,7 @@
                       <w:color w:val="000000"/>
                       <w:sz w:val="21"/>
                     </w:rPr>
-                    <w:t>图4　AMA物理分批与回退流程</w:t>
+                    <w:t>图4  AMA物理分批与回退流程</w:t>
                   </w:r>
                 </w:p>
                 <w:p>
@@ -3473,7 +3596,7 @@
                   <w:r>
                     <w:drawing>
                       <wp:inline xmlns:a="http://schemas.openxmlformats.org/drawingml/2006/main" xmlns:pic="http://schemas.openxmlformats.org/drawingml/2006/picture">
-                        <wp:extent cx="5257800" cy="6134100"/>
+                        <wp:extent cx="4114800" cy="4800600"/>
                         <wp:docPr id="4" name="Picture 4"/>
                         <wp:cNvGraphicFramePr>
                           <a:graphicFrameLocks noChangeAspect="1"/>
@@ -3494,7 +3617,7 @@
                               <pic:spPr>
                                 <a:xfrm>
                                   <a:off x="0" y="0"/>
-                                  <a:ext cx="5257800" cy="6134100"/>
+                                  <a:ext cx="4114800" cy="4800600"/>
                                 </a:xfrm>
                                 <a:prstGeom prst="rect"/>
                               </pic:spPr>
@@ -3512,7 +3635,7 @@
           <w:p>
             <w:pPr>
               <w:keepNext/>
-              <w:spacing w:before="80" w:after="40" w:line="360" w:lineRule="auto"/>
+              <w:spacing w:before="60" w:after="20" w:line="312" w:lineRule="auto"/>
               <w:jc w:val="left"/>
             </w:pPr>
             <w:r>
@@ -3529,7 +3652,7 @@
           <w:p>
             <w:pPr>
               <w:keepNext w:val="0"/>
-              <w:spacing w:before="0" w:after="40" w:line="360" w:lineRule="auto"/>
+              <w:spacing w:before="0" w:after="40" w:line="312" w:lineRule="auto"/>
               <w:ind w:firstLine="420"/>
               <w:jc w:val="both"/>
             </w:pPr>
@@ -3541,7 +3664,7 @@
                 <w:color w:val="000000"/>
                 <w:sz w:val="21"/>
               </w:rPr>
-              <w:t>获取 Report：LithoPiLotAutoDoAdhocSorter 栏位信息，并按顺序调用 MES Transfer FOUP 接口，将 Pilot 导入空 FOUP。若无法取得可用空 FOUP、空 FOUP 数量为 0，或 MES Transfer FOUP 接口失败，则在 AMALog 中记录失败信息；后续继续沿用现有 Adhoc Sorter 流程。</w:t>
+              <w:t>获取 Report：LithoPiLotAutoDoAdhocSorter 栏位信息，并按顺序给 MES 打 TransferFOUP 接口，将 Pilot 导到空 FOUP 中，若拿取可用的空 Foup 失败或空 Foup 数量为0，或 MES TransferFOUP 接口失败，则在 AMALog 中记录 Fail 信息。</w:t>
             </w:r>
           </w:p>
         </w:tc>
@@ -3549,11 +3672,12 @@
       <w:tr>
         <w:trPr>
           <w:cantSplit/>
-          <w:trHeight w:val="1871" w:hRule="atLeast"/>
+          <w:trHeight w:val="1531" w:hRule="exact"/>
         </w:trPr>
         <w:tc>
           <w:tcPr>
             <w:tcW w:type="dxa" w:w="5190"/>
+            <w:gridSpan w:val="5"/>
             <w:tcMar>
               <w:top w:w="90" w:type="dxa"/>
               <w:start w:w="120" w:type="dxa"/>
@@ -3571,7 +3695,7 @@
           <w:p>
             <w:pPr>
               <w:keepNext/>
-              <w:spacing w:before="100" w:after="40" w:line="360" w:lineRule="auto"/>
+              <w:spacing w:before="60" w:after="20" w:line="312" w:lineRule="auto"/>
               <w:jc w:val="left"/>
             </w:pPr>
             <w:r>
@@ -3588,7 +3712,7 @@
           <w:p>
             <w:pPr>
               <w:keepNext w:val="0"/>
-              <w:spacing w:before="0" w:after="360" w:line="360" w:lineRule="auto"/>
+              <w:spacing w:before="0" w:after="80" w:line="312" w:lineRule="auto"/>
               <w:jc w:val="both"/>
             </w:pPr>
             <w:r>
@@ -3604,7 +3728,7 @@
           <w:p>
             <w:pPr>
               <w:keepNext/>
-              <w:spacing w:before="80" w:after="40" w:line="360" w:lineRule="auto"/>
+              <w:spacing w:before="60" w:after="20" w:line="312" w:lineRule="auto"/>
               <w:jc w:val="left"/>
             </w:pPr>
             <w:r>
@@ -3622,6 +3746,7 @@
         <w:tc>
           <w:tcPr>
             <w:tcW w:type="dxa" w:w="5190"/>
+            <w:gridSpan w:val="5"/>
             <w:tcMar>
               <w:top w:w="90" w:type="dxa"/>
               <w:start w:w="120" w:type="dxa"/>
@@ -3639,7 +3764,7 @@
           <w:p>
             <w:pPr>
               <w:keepNext/>
-              <w:spacing w:before="100" w:after="40" w:line="360" w:lineRule="auto"/>
+              <w:spacing w:before="60" w:after="20" w:line="312" w:lineRule="auto"/>
               <w:jc w:val="left"/>
             </w:pPr>
             <w:r>
@@ -3656,7 +3781,7 @@
           <w:p>
             <w:pPr>
               <w:keepNext w:val="0"/>
-              <w:spacing w:before="0" w:after="360" w:line="360" w:lineRule="auto"/>
+              <w:spacing w:before="0" w:after="80" w:line="312" w:lineRule="auto"/>
               <w:jc w:val="both"/>
             </w:pPr>
             <w:r>
@@ -3672,7 +3797,7 @@
           <w:p>
             <w:pPr>
               <w:keepNext/>
-              <w:spacing w:before="80" w:after="40" w:line="360" w:lineRule="auto"/>
+              <w:spacing w:before="60" w:after="20" w:line="312" w:lineRule="auto"/>
               <w:jc w:val="left"/>
             </w:pPr>
             <w:r>
@@ -3691,11 +3816,12 @@
       <w:tr>
         <w:trPr>
           <w:cantSplit/>
-          <w:trHeight w:val="1871" w:hRule="atLeast"/>
+          <w:trHeight w:val="1531" w:hRule="exact"/>
         </w:trPr>
         <w:tc>
           <w:tcPr>
             <w:tcW w:type="dxa" w:w="5190"/>
+            <w:gridSpan w:val="5"/>
             <w:tcMar>
               <w:top w:w="90" w:type="dxa"/>
               <w:start w:w="120" w:type="dxa"/>
@@ -3713,7 +3839,7 @@
           <w:p>
             <w:pPr>
               <w:keepNext/>
-              <w:spacing w:before="100" w:after="40" w:line="360" w:lineRule="auto"/>
+              <w:spacing w:before="60" w:after="20" w:line="312" w:lineRule="auto"/>
               <w:jc w:val="left"/>
             </w:pPr>
             <w:r>
@@ -3730,7 +3856,7 @@
           <w:p>
             <w:pPr>
               <w:keepNext w:val="0"/>
-              <w:spacing w:before="0" w:after="360" w:line="360" w:lineRule="auto"/>
+              <w:spacing w:before="0" w:after="80" w:line="312" w:lineRule="auto"/>
               <w:jc w:val="both"/>
             </w:pPr>
             <w:r>
@@ -3746,7 +3872,7 @@
           <w:p>
             <w:pPr>
               <w:keepNext/>
-              <w:spacing w:before="80" w:after="40" w:line="360" w:lineRule="auto"/>
+              <w:spacing w:before="60" w:after="20" w:line="312" w:lineRule="auto"/>
               <w:jc w:val="left"/>
             </w:pPr>
             <w:r>
@@ -3764,6 +3890,7 @@
         <w:tc>
           <w:tcPr>
             <w:tcW w:type="dxa" w:w="5190"/>
+            <w:gridSpan w:val="5"/>
             <w:tcMar>
               <w:top w:w="90" w:type="dxa"/>
               <w:start w:w="120" w:type="dxa"/>
@@ -3781,7 +3908,7 @@
           <w:p>
             <w:pPr>
               <w:keepNext/>
-              <w:spacing w:before="100" w:after="40" w:line="360" w:lineRule="auto"/>
+              <w:spacing w:before="60" w:after="20" w:line="312" w:lineRule="auto"/>
               <w:jc w:val="left"/>
             </w:pPr>
             <w:r>
@@ -3798,7 +3925,7 @@
           <w:p>
             <w:pPr>
               <w:keepNext w:val="0"/>
-              <w:spacing w:before="0" w:after="360" w:line="360" w:lineRule="auto"/>
+              <w:spacing w:before="0" w:after="80" w:line="312" w:lineRule="auto"/>
               <w:jc w:val="both"/>
             </w:pPr>
             <w:r>
@@ -3814,7 +3941,7 @@
           <w:p>
             <w:pPr>
               <w:keepNext/>
-              <w:spacing w:before="80" w:after="40" w:line="360" w:lineRule="auto"/>
+              <w:spacing w:before="60" w:after="20" w:line="312" w:lineRule="auto"/>
               <w:jc w:val="left"/>
             </w:pPr>
             <w:r>
@@ -3833,11 +3960,12 @@
       <w:tr>
         <w:trPr>
           <w:cantSplit/>
-          <w:trHeight w:val="1871" w:hRule="atLeast"/>
+          <w:trHeight w:val="1531" w:hRule="exact"/>
         </w:trPr>
         <w:tc>
           <w:tcPr>
             <w:tcW w:type="dxa" w:w="5190"/>
+            <w:gridSpan w:val="5"/>
             <w:tcMar>
               <w:top w:w="90" w:type="dxa"/>
               <w:start w:w="120" w:type="dxa"/>
@@ -3855,7 +3983,7 @@
           <w:p>
             <w:pPr>
               <w:keepNext/>
-              <w:spacing w:before="100" w:after="40" w:line="360" w:lineRule="auto"/>
+              <w:spacing w:before="60" w:after="20" w:line="312" w:lineRule="auto"/>
               <w:jc w:val="left"/>
             </w:pPr>
             <w:r>
@@ -3872,7 +4000,7 @@
           <w:p>
             <w:pPr>
               <w:keepNext w:val="0"/>
-              <w:spacing w:before="0" w:after="360" w:line="360" w:lineRule="auto"/>
+              <w:spacing w:before="0" w:after="80" w:line="312" w:lineRule="auto"/>
               <w:jc w:val="both"/>
             </w:pPr>
             <w:r>
@@ -3888,7 +4016,7 @@
           <w:p>
             <w:pPr>
               <w:keepNext/>
-              <w:spacing w:before="80" w:after="40" w:line="360" w:lineRule="auto"/>
+              <w:spacing w:before="60" w:after="20" w:line="312" w:lineRule="auto"/>
               <w:jc w:val="left"/>
             </w:pPr>
             <w:r>
@@ -3906,6 +4034,7 @@
         <w:tc>
           <w:tcPr>
             <w:tcW w:type="dxa" w:w="5190"/>
+            <w:gridSpan w:val="5"/>
             <w:tcMar>
               <w:top w:w="90" w:type="dxa"/>
               <w:start w:w="120" w:type="dxa"/>
@@ -3923,7 +4052,7 @@
           <w:p>
             <w:pPr>
               <w:keepNext/>
-              <w:spacing w:before="100" w:after="40" w:line="360" w:lineRule="auto"/>
+              <w:spacing w:before="60" w:after="20" w:line="312" w:lineRule="auto"/>
               <w:jc w:val="left"/>
             </w:pPr>
             <w:r>
@@ -3940,7 +4069,7 @@
           <w:p>
             <w:pPr>
               <w:keepNext w:val="0"/>
-              <w:spacing w:before="0" w:after="360" w:line="360" w:lineRule="auto"/>
+              <w:spacing w:before="0" w:after="80" w:line="312" w:lineRule="auto"/>
               <w:jc w:val="both"/>
             </w:pPr>
             <w:r>
@@ -3956,7 +4085,7 @@
           <w:p>
             <w:pPr>
               <w:keepNext/>
-              <w:spacing w:before="80" w:after="40" w:line="360" w:lineRule="auto"/>
+              <w:spacing w:before="60" w:after="20" w:line="312" w:lineRule="auto"/>
               <w:jc w:val="left"/>
             </w:pPr>
             <w:r>

</xml_diff>

<commit_message>
vault backup: 2026-07-25 18:36:24
</commit_message>
<xml_diff>
--- a/00.raw-materials/90.processed/LithoAutoPiRun/LithoAutoPiRun_需求申请单_最终版.docx
+++ b/00.raw-materials/90.processed/LithoAutoPiRun/LithoAutoPiRun_需求申请单_最终版.docx
@@ -3711,24 +3711,8 @@
           </w:p>
           <w:p>
             <w:pPr>
-              <w:keepNext w:val="0"/>
-              <w:spacing w:before="0" w:after="80" w:line="312" w:lineRule="auto"/>
-              <w:jc w:val="both"/>
-            </w:pPr>
-            <w:r>
-              <w:rPr>
-                <w:rFonts w:ascii="Times New Roman" w:hAnsi="Times New Roman" w:eastAsia="SimSun" w:cs="Times New Roman"/>
-                <w:b w:val="0"/>
-                <w:i w:val="0"/>
-                <w:color w:val="000000"/>
-                <w:sz w:val="21"/>
-              </w:rPr>
-            </w:r>
-          </w:p>
-          <w:p>
-            <w:pPr>
               <w:keepNext/>
-              <w:spacing w:before="60" w:after="20" w:line="312" w:lineRule="auto"/>
+              <w:spacing w:before="360" w:after="20" w:line="312" w:lineRule="auto"/>
               <w:jc w:val="left"/>
             </w:pPr>
             <w:r>
@@ -3780,24 +3764,8 @@
           </w:p>
           <w:p>
             <w:pPr>
-              <w:keepNext w:val="0"/>
-              <w:spacing w:before="0" w:after="80" w:line="312" w:lineRule="auto"/>
-              <w:jc w:val="both"/>
-            </w:pPr>
-            <w:r>
-              <w:rPr>
-                <w:rFonts w:ascii="Times New Roman" w:hAnsi="Times New Roman" w:eastAsia="SimSun" w:cs="Times New Roman"/>
-                <w:b w:val="0"/>
-                <w:i w:val="0"/>
-                <w:color w:val="000000"/>
-                <w:sz w:val="21"/>
-              </w:rPr>
-            </w:r>
-          </w:p>
-          <w:p>
-            <w:pPr>
               <w:keepNext/>
-              <w:spacing w:before="60" w:after="20" w:line="312" w:lineRule="auto"/>
+              <w:spacing w:before="360" w:after="20" w:line="312" w:lineRule="auto"/>
               <w:jc w:val="left"/>
             </w:pPr>
             <w:r>
@@ -3855,24 +3823,8 @@
           </w:p>
           <w:p>
             <w:pPr>
-              <w:keepNext w:val="0"/>
-              <w:spacing w:before="0" w:after="80" w:line="312" w:lineRule="auto"/>
-              <w:jc w:val="both"/>
-            </w:pPr>
-            <w:r>
-              <w:rPr>
-                <w:rFonts w:ascii="Times New Roman" w:hAnsi="Times New Roman" w:eastAsia="SimSun" w:cs="Times New Roman"/>
-                <w:b w:val="0"/>
-                <w:i w:val="0"/>
-                <w:color w:val="000000"/>
-                <w:sz w:val="21"/>
-              </w:rPr>
-            </w:r>
-          </w:p>
-          <w:p>
-            <w:pPr>
               <w:keepNext/>
-              <w:spacing w:before="60" w:after="20" w:line="312" w:lineRule="auto"/>
+              <w:spacing w:before="360" w:after="20" w:line="312" w:lineRule="auto"/>
               <w:jc w:val="left"/>
             </w:pPr>
             <w:r>
@@ -3924,24 +3876,8 @@
           </w:p>
           <w:p>
             <w:pPr>
-              <w:keepNext w:val="0"/>
-              <w:spacing w:before="0" w:after="80" w:line="312" w:lineRule="auto"/>
-              <w:jc w:val="both"/>
-            </w:pPr>
-            <w:r>
-              <w:rPr>
-                <w:rFonts w:ascii="Times New Roman" w:hAnsi="Times New Roman" w:eastAsia="SimSun" w:cs="Times New Roman"/>
-                <w:b w:val="0"/>
-                <w:i w:val="0"/>
-                <w:color w:val="000000"/>
-                <w:sz w:val="21"/>
-              </w:rPr>
-            </w:r>
-          </w:p>
-          <w:p>
-            <w:pPr>
               <w:keepNext/>
-              <w:spacing w:before="60" w:after="20" w:line="312" w:lineRule="auto"/>
+              <w:spacing w:before="360" w:after="20" w:line="312" w:lineRule="auto"/>
               <w:jc w:val="left"/>
             </w:pPr>
             <w:r>
@@ -3999,24 +3935,8 @@
           </w:p>
           <w:p>
             <w:pPr>
-              <w:keepNext w:val="0"/>
-              <w:spacing w:before="0" w:after="80" w:line="312" w:lineRule="auto"/>
-              <w:jc w:val="both"/>
-            </w:pPr>
-            <w:r>
-              <w:rPr>
-                <w:rFonts w:ascii="Times New Roman" w:hAnsi="Times New Roman" w:eastAsia="SimSun" w:cs="Times New Roman"/>
-                <w:b w:val="0"/>
-                <w:i w:val="0"/>
-                <w:color w:val="000000"/>
-                <w:sz w:val="21"/>
-              </w:rPr>
-            </w:r>
-          </w:p>
-          <w:p>
-            <w:pPr>
               <w:keepNext/>
-              <w:spacing w:before="60" w:after="20" w:line="312" w:lineRule="auto"/>
+              <w:spacing w:before="360" w:after="20" w:line="312" w:lineRule="auto"/>
               <w:jc w:val="left"/>
             </w:pPr>
             <w:r>
@@ -4068,24 +3988,8 @@
           </w:p>
           <w:p>
             <w:pPr>
-              <w:keepNext w:val="0"/>
-              <w:spacing w:before="0" w:after="80" w:line="312" w:lineRule="auto"/>
-              <w:jc w:val="both"/>
-            </w:pPr>
-            <w:r>
-              <w:rPr>
-                <w:rFonts w:ascii="Times New Roman" w:hAnsi="Times New Roman" w:eastAsia="SimSun" w:cs="Times New Roman"/>
-                <w:b w:val="0"/>
-                <w:i w:val="0"/>
-                <w:color w:val="000000"/>
-                <w:sz w:val="21"/>
-              </w:rPr>
-            </w:r>
-          </w:p>
-          <w:p>
-            <w:pPr>
               <w:keepNext/>
-              <w:spacing w:before="60" w:after="20" w:line="312" w:lineRule="auto"/>
+              <w:spacing w:before="360" w:after="20" w:line="312" w:lineRule="auto"/>
               <w:jc w:val="left"/>
             </w:pPr>
             <w:r>

</xml_diff>